<commit_message>
Add links to code and artifacts throughout the report
</commit_message>
<xml_diff>
--- a/GPU assignments/GPU Lab 1/HW2.5_Document.docx
+++ b/GPU assignments/GPU Lab 1/HW2.5_Document.docx
@@ -294,6 +294,101 @@
     </w:p>
     <w:p>
       <w:pPr>
+        <w:spacing w:after="200" w:line="276"/>
+      </w:pPr>
+      <w:r>
+        <w:rPr>
+          <w:rFonts w:ascii="Calibri" w:cs="Calibri" w:eastAsia="Calibri" w:hAnsi="Calibri"/>
+          <w:b/>
+          <w:bCs/>
+          <w:color w:val="52514E"/>
+          <w:sz w:val="19"/>
+          <w:szCs w:val="19"/>
+        </w:rPr>
+        <w:t xml:space="preserve">Code and artifacts:  </w:t>
+      </w:r>
+      <w:hyperlink w:history="1" r:id="rIdlt4umgp8m4mq3q1ippbzt">
+        <w:r>
+          <w:rPr>
+            <w:rStyle w:val="Hyperlink"/>
+            <w:rFonts w:ascii="Calibri" w:cs="Calibri" w:eastAsia="Calibri" w:hAnsi="Calibri"/>
+            <w:color w:val="1155CC"/>
+            <w:sz w:val="19"/>
+            <w:szCs w:val="19"/>
+            <w:u w:val="single"/>
+          </w:rPr>
+          <w:t xml:space="preserve">part_a_provenance.py</w:t>
+        </w:r>
+      </w:hyperlink>
+      <w:r>
+        <w:rPr>
+          <w:rFonts w:ascii="Calibri" w:cs="Calibri" w:eastAsia="Calibri" w:hAnsi="Calibri"/>
+          <w:color w:val="52514E"/>
+          <w:sz w:val="19"/>
+          <w:szCs w:val="19"/>
+        </w:rPr>
+        <w:t xml:space="preserve">   ·   </w:t>
+      </w:r>
+      <w:hyperlink w:history="1" r:id="rIdoznwmx9ll85_hkzztxix6">
+        <w:r>
+          <w:rPr>
+            <w:rStyle w:val="Hyperlink"/>
+            <w:rFonts w:ascii="Calibri" w:cs="Calibri" w:eastAsia="Calibri" w:hAnsi="Calibri"/>
+            <w:color w:val="1155CC"/>
+            <w:sz w:val="19"/>
+            <w:szCs w:val="19"/>
+            <w:u w:val="single"/>
+          </w:rPr>
+          <w:t xml:space="preserve">gpu_specs.json</w:t>
+        </w:r>
+      </w:hyperlink>
+      <w:r>
+        <w:rPr>
+          <w:rFonts w:ascii="Calibri" w:cs="Calibri" w:eastAsia="Calibri" w:hAnsi="Calibri"/>
+          <w:color w:val="52514E"/>
+          <w:sz w:val="19"/>
+          <w:szCs w:val="19"/>
+        </w:rPr>
+        <w:t xml:space="preserve">   ·   </w:t>
+      </w:r>
+      <w:hyperlink w:history="1" r:id="rIdgqbpluogdokwfajuqf4b_">
+        <w:r>
+          <w:rPr>
+            <w:rStyle w:val="Hyperlink"/>
+            <w:rFonts w:ascii="Calibri" w:cs="Calibri" w:eastAsia="Calibri" w:hAnsi="Calibri"/>
+            <w:color w:val="1155CC"/>
+            <w:sz w:val="19"/>
+            <w:szCs w:val="19"/>
+            <w:u w:val="single"/>
+          </w:rPr>
+          <w:t xml:space="preserve">nvidia-smi -q capture</w:t>
+        </w:r>
+      </w:hyperlink>
+      <w:r>
+        <w:rPr>
+          <w:rFonts w:ascii="Calibri" w:cs="Calibri" w:eastAsia="Calibri" w:hAnsi="Calibri"/>
+          <w:color w:val="52514E"/>
+          <w:sz w:val="19"/>
+          <w:szCs w:val="19"/>
+        </w:rPr>
+        <w:t xml:space="preserve">   ·   </w:t>
+      </w:r>
+      <w:hyperlink w:history="1" r:id="rId6ghcjifqb0vtxybmlnnuf">
+        <w:r>
+          <w:rPr>
+            <w:rStyle w:val="Hyperlink"/>
+            <w:rFonts w:ascii="Calibri" w:cs="Calibri" w:eastAsia="Calibri" w:hAnsi="Calibri"/>
+            <w:color w:val="1155CC"/>
+            <w:sz w:val="19"/>
+            <w:szCs w:val="19"/>
+            <w:u w:val="single"/>
+          </w:rPr>
+          <w:t xml:space="preserve">identity JSON</w:t>
+        </w:r>
+      </w:hyperlink>
+    </w:p>
+    <w:p>
+      <w:pPr>
         <w:spacing w:after="120" w:line="276"/>
       </w:pPr>
       <w:r>
@@ -1481,6 +1576,79 @@
       <w:r>
         <w:t xml:space="preserve">3. Part B: precision and achieved throughput</w:t>
       </w:r>
+    </w:p>
+    <w:p>
+      <w:pPr>
+        <w:spacing w:after="200" w:line="276"/>
+      </w:pPr>
+      <w:r>
+        <w:rPr>
+          <w:rFonts w:ascii="Calibri" w:cs="Calibri" w:eastAsia="Calibri" w:hAnsi="Calibri"/>
+          <w:b/>
+          <w:bCs/>
+          <w:color w:val="52514E"/>
+          <w:sz w:val="19"/>
+          <w:szCs w:val="19"/>
+        </w:rPr>
+        <w:t xml:space="preserve">Code and artifacts:  </w:t>
+      </w:r>
+      <w:hyperlink w:history="1" r:id="rId9ljslubwdhr8eboxrdfbb">
+        <w:r>
+          <w:rPr>
+            <w:rStyle w:val="Hyperlink"/>
+            <w:rFonts w:ascii="Calibri" w:cs="Calibri" w:eastAsia="Calibri" w:hAnsi="Calibri"/>
+            <w:color w:val="1155CC"/>
+            <w:sz w:val="19"/>
+            <w:szCs w:val="19"/>
+            <w:u w:val="single"/>
+          </w:rPr>
+          <w:t xml:space="preserve">part_b_precision.py</w:t>
+        </w:r>
+      </w:hyperlink>
+      <w:r>
+        <w:rPr>
+          <w:rFonts w:ascii="Calibri" w:cs="Calibri" w:eastAsia="Calibri" w:hAnsi="Calibri"/>
+          <w:color w:val="52514E"/>
+          <w:sz w:val="19"/>
+          <w:szCs w:val="19"/>
+        </w:rPr>
+        <w:t xml:space="preserve">   ·   </w:t>
+      </w:r>
+      <w:hyperlink w:history="1" r:id="rIdgcaxyjjtn3le9408161fz">
+        <w:r>
+          <w:rPr>
+            <w:rStyle w:val="Hyperlink"/>
+            <w:rFonts w:ascii="Calibri" w:cs="Calibri" w:eastAsia="Calibri" w:hAnsi="Calibri"/>
+            <w:color w:val="1155CC"/>
+            <w:sz w:val="19"/>
+            <w:szCs w:val="19"/>
+            <w:u w:val="single"/>
+          </w:rPr>
+          <w:t xml:space="preserve">results CSV</w:t>
+        </w:r>
+      </w:hyperlink>
+      <w:r>
+        <w:rPr>
+          <w:rFonts w:ascii="Calibri" w:cs="Calibri" w:eastAsia="Calibri" w:hAnsi="Calibri"/>
+          <w:color w:val="52514E"/>
+          <w:sz w:val="19"/>
+          <w:szCs w:val="19"/>
+        </w:rPr>
+        <w:t xml:space="preserve">   ·   </w:t>
+      </w:r>
+      <w:hyperlink w:history="1" r:id="rIdk5pfyyphyfqvvustbglyo">
+        <w:r>
+          <w:rPr>
+            <w:rStyle w:val="Hyperlink"/>
+            <w:rFonts w:ascii="Calibri" w:cs="Calibri" w:eastAsia="Calibri" w:hAnsi="Calibri"/>
+            <w:color w:val="1155CC"/>
+            <w:sz w:val="19"/>
+            <w:szCs w:val="19"/>
+            <w:u w:val="single"/>
+          </w:rPr>
+          <w:t xml:space="preserve">figure</w:t>
+        </w:r>
+      </w:hyperlink>
     </w:p>
     <w:p>
       <w:pPr>
@@ -6625,6 +6793,79 @@
     </w:p>
     <w:p>
       <w:pPr>
+        <w:spacing w:after="200" w:line="276"/>
+      </w:pPr>
+      <w:r>
+        <w:rPr>
+          <w:rFonts w:ascii="Calibri" w:cs="Calibri" w:eastAsia="Calibri" w:hAnsi="Calibri"/>
+          <w:b/>
+          <w:bCs/>
+          <w:color w:val="52514E"/>
+          <w:sz w:val="19"/>
+          <w:szCs w:val="19"/>
+        </w:rPr>
+        <w:t xml:space="preserve">Code and artifacts:  </w:t>
+      </w:r>
+      <w:hyperlink w:history="1" r:id="rIddelsvrb-2af56tir4fk2-">
+        <w:r>
+          <w:rPr>
+            <w:rStyle w:val="Hyperlink"/>
+            <w:rFonts w:ascii="Calibri" w:cs="Calibri" w:eastAsia="Calibri" w:hAnsi="Calibri"/>
+            <w:color w:val="1155CC"/>
+            <w:sz w:val="19"/>
+            <w:szCs w:val="19"/>
+            <w:u w:val="single"/>
+          </w:rPr>
+          <w:t xml:space="preserve">part_c_roofline.py</w:t>
+        </w:r>
+      </w:hyperlink>
+      <w:r>
+        <w:rPr>
+          <w:rFonts w:ascii="Calibri" w:cs="Calibri" w:eastAsia="Calibri" w:hAnsi="Calibri"/>
+          <w:color w:val="52514E"/>
+          <w:sz w:val="19"/>
+          <w:szCs w:val="19"/>
+        </w:rPr>
+        <w:t xml:space="preserve">   ·   </w:t>
+      </w:r>
+      <w:hyperlink w:history="1" r:id="rIddp7wfepbvyc3qc0g897on">
+        <w:r>
+          <w:rPr>
+            <w:rStyle w:val="Hyperlink"/>
+            <w:rFonts w:ascii="Calibri" w:cs="Calibri" w:eastAsia="Calibri" w:hAnsi="Calibri"/>
+            <w:color w:val="1155CC"/>
+            <w:sz w:val="19"/>
+            <w:szCs w:val="19"/>
+            <w:u w:val="single"/>
+          </w:rPr>
+          <w:t xml:space="preserve">results CSV</w:t>
+        </w:r>
+      </w:hyperlink>
+      <w:r>
+        <w:rPr>
+          <w:rFonts w:ascii="Calibri" w:cs="Calibri" w:eastAsia="Calibri" w:hAnsi="Calibri"/>
+          <w:color w:val="52514E"/>
+          <w:sz w:val="19"/>
+          <w:szCs w:val="19"/>
+        </w:rPr>
+        <w:t xml:space="preserve">   ·   </w:t>
+      </w:r>
+      <w:hyperlink w:history="1" r:id="rIdkclzhhurwsi3omei8mlmg">
+        <w:r>
+          <w:rPr>
+            <w:rStyle w:val="Hyperlink"/>
+            <w:rFonts w:ascii="Calibri" w:cs="Calibri" w:eastAsia="Calibri" w:hAnsi="Calibri"/>
+            <w:color w:val="1155CC"/>
+            <w:sz w:val="19"/>
+            <w:szCs w:val="19"/>
+            <w:u w:val="single"/>
+          </w:rPr>
+          <w:t xml:space="preserve">figure</w:t>
+        </w:r>
+      </w:hyperlink>
+    </w:p>
+    <w:p>
+      <w:pPr>
         <w:spacing w:after="120" w:line="276"/>
       </w:pPr>
       <w:r>
@@ -7437,6 +7678,123 @@
       <w:r>
         <w:t xml:space="preserve">5. Part D: the cost of attention</w:t>
       </w:r>
+    </w:p>
+    <w:p>
+      <w:pPr>
+        <w:spacing w:after="200" w:line="276"/>
+      </w:pPr>
+      <w:r>
+        <w:rPr>
+          <w:rFonts w:ascii="Calibri" w:cs="Calibri" w:eastAsia="Calibri" w:hAnsi="Calibri"/>
+          <w:b/>
+          <w:bCs/>
+          <w:color w:val="52514E"/>
+          <w:sz w:val="19"/>
+          <w:szCs w:val="19"/>
+        </w:rPr>
+        <w:t xml:space="preserve">Code and artifacts:  </w:t>
+      </w:r>
+      <w:hyperlink w:history="1" r:id="rIdtky9yan1xzf6-vyce_brx">
+        <w:r>
+          <w:rPr>
+            <w:rStyle w:val="Hyperlink"/>
+            <w:rFonts w:ascii="Calibri" w:cs="Calibri" w:eastAsia="Calibri" w:hAnsi="Calibri"/>
+            <w:color w:val="1155CC"/>
+            <w:sz w:val="19"/>
+            <w:szCs w:val="19"/>
+            <w:u w:val="single"/>
+          </w:rPr>
+          <w:t xml:space="preserve">part_d_attention.py</w:t>
+        </w:r>
+      </w:hyperlink>
+      <w:r>
+        <w:rPr>
+          <w:rFonts w:ascii="Calibri" w:cs="Calibri" w:eastAsia="Calibri" w:hAnsi="Calibri"/>
+          <w:color w:val="52514E"/>
+          <w:sz w:val="19"/>
+          <w:szCs w:val="19"/>
+        </w:rPr>
+        <w:t xml:space="preserve">   ·   </w:t>
+      </w:r>
+      <w:hyperlink w:history="1" r:id="rIdxg4rtqp7uv5bxadqv1ecc">
+        <w:r>
+          <w:rPr>
+            <w:rStyle w:val="Hyperlink"/>
+            <w:rFonts w:ascii="Calibri" w:cs="Calibri" w:eastAsia="Calibri" w:hAnsi="Calibri"/>
+            <w:color w:val="1155CC"/>
+            <w:sz w:val="19"/>
+            <w:szCs w:val="19"/>
+            <w:u w:val="single"/>
+          </w:rPr>
+          <w:t xml:space="preserve">results CSV</w:t>
+        </w:r>
+      </w:hyperlink>
+      <w:r>
+        <w:rPr>
+          <w:rFonts w:ascii="Calibri" w:cs="Calibri" w:eastAsia="Calibri" w:hAnsi="Calibri"/>
+          <w:color w:val="52514E"/>
+          <w:sz w:val="19"/>
+          <w:szCs w:val="19"/>
+        </w:rPr>
+        <w:t xml:space="preserve">   ·   </w:t>
+      </w:r>
+      <w:hyperlink w:history="1" r:id="rIdzn8l0jric_xbne399pk0a">
+        <w:r>
+          <w:rPr>
+            <w:rStyle w:val="Hyperlink"/>
+            <w:rFonts w:ascii="Calibri" w:cs="Calibri" w:eastAsia="Calibri" w:hAnsi="Calibri"/>
+            <w:color w:val="1155CC"/>
+            <w:sz w:val="19"/>
+            <w:szCs w:val="19"/>
+            <w:u w:val="single"/>
+          </w:rPr>
+          <w:t xml:space="preserve">summary JSON</w:t>
+        </w:r>
+      </w:hyperlink>
+      <w:r>
+        <w:rPr>
+          <w:rFonts w:ascii="Calibri" w:cs="Calibri" w:eastAsia="Calibri" w:hAnsi="Calibri"/>
+          <w:color w:val="52514E"/>
+          <w:sz w:val="19"/>
+          <w:szCs w:val="19"/>
+        </w:rPr>
+        <w:t xml:space="preserve">   ·   </w:t>
+      </w:r>
+      <w:hyperlink w:history="1" r:id="rIdzctr2dmvegsnoeiejy9a5">
+        <w:r>
+          <w:rPr>
+            <w:rStyle w:val="Hyperlink"/>
+            <w:rFonts w:ascii="Calibri" w:cs="Calibri" w:eastAsia="Calibri" w:hAnsi="Calibri"/>
+            <w:color w:val="1155CC"/>
+            <w:sz w:val="19"/>
+            <w:szCs w:val="19"/>
+            <w:u w:val="single"/>
+          </w:rPr>
+          <w:t xml:space="preserve">memory figure</w:t>
+        </w:r>
+      </w:hyperlink>
+      <w:r>
+        <w:rPr>
+          <w:rFonts w:ascii="Calibri" w:cs="Calibri" w:eastAsia="Calibri" w:hAnsi="Calibri"/>
+          <w:color w:val="52514E"/>
+          <w:sz w:val="19"/>
+          <w:szCs w:val="19"/>
+        </w:rPr>
+        <w:t xml:space="preserve">   ·   </w:t>
+      </w:r>
+      <w:hyperlink w:history="1" r:id="rIdfuhucpe0mwxiv4enmg9gf">
+        <w:r>
+          <w:rPr>
+            <w:rStyle w:val="Hyperlink"/>
+            <w:rFonts w:ascii="Calibri" w:cs="Calibri" w:eastAsia="Calibri" w:hAnsi="Calibri"/>
+            <w:color w:val="1155CC"/>
+            <w:sz w:val="19"/>
+            <w:szCs w:val="19"/>
+            <w:u w:val="single"/>
+          </w:rPr>
+          <w:t xml:space="preserve">latency figure</w:t>
+        </w:r>
+      </w:hyperlink>
     </w:p>
     <w:p>
       <w:pPr>
@@ -9949,6 +10307,123 @@
     </w:p>
     <w:p>
       <w:pPr>
+        <w:spacing w:after="200" w:line="276"/>
+      </w:pPr>
+      <w:r>
+        <w:rPr>
+          <w:rFonts w:ascii="Calibri" w:cs="Calibri" w:eastAsia="Calibri" w:hAnsi="Calibri"/>
+          <w:b/>
+          <w:bCs/>
+          <w:color w:val="52514E"/>
+          <w:sz w:val="19"/>
+          <w:szCs w:val="19"/>
+        </w:rPr>
+        <w:t xml:space="preserve">Code and artifacts:  </w:t>
+      </w:r>
+      <w:hyperlink w:history="1" r:id="rId3bt4zlwy6vbw7a1cs8nri">
+        <w:r>
+          <w:rPr>
+            <w:rStyle w:val="Hyperlink"/>
+            <w:rFonts w:ascii="Calibri" w:cs="Calibri" w:eastAsia="Calibri" w:hAnsi="Calibri"/>
+            <w:color w:val="1155CC"/>
+            <w:sz w:val="19"/>
+            <w:szCs w:val="19"/>
+            <w:u w:val="single"/>
+          </w:rPr>
+          <w:t xml:space="preserve">part_e_thermal.py</w:t>
+        </w:r>
+      </w:hyperlink>
+      <w:r>
+        <w:rPr>
+          <w:rFonts w:ascii="Calibri" w:cs="Calibri" w:eastAsia="Calibri" w:hAnsi="Calibri"/>
+          <w:color w:val="52514E"/>
+          <w:sz w:val="19"/>
+          <w:szCs w:val="19"/>
+        </w:rPr>
+        <w:t xml:space="preserve">   ·   </w:t>
+      </w:r>
+      <w:hyperlink w:history="1" r:id="rIdzaickx40vjfkkjqhcsiqy">
+        <w:r>
+          <w:rPr>
+            <w:rStyle w:val="Hyperlink"/>
+            <w:rFonts w:ascii="Calibri" w:cs="Calibri" w:eastAsia="Calibri" w:hAnsi="Calibri"/>
+            <w:color w:val="1155CC"/>
+            <w:sz w:val="19"/>
+            <w:szCs w:val="19"/>
+            <w:u w:val="single"/>
+          </w:rPr>
+          <w:t xml:space="preserve">thermal log</w:t>
+        </w:r>
+      </w:hyperlink>
+      <w:r>
+        <w:rPr>
+          <w:rFonts w:ascii="Calibri" w:cs="Calibri" w:eastAsia="Calibri" w:hAnsi="Calibri"/>
+          <w:color w:val="52514E"/>
+          <w:sz w:val="19"/>
+          <w:szCs w:val="19"/>
+        </w:rPr>
+        <w:t xml:space="preserve">   ·   </w:t>
+      </w:r>
+      <w:hyperlink w:history="1" r:id="rIdeyq7oplytjkd97ulg0yxl">
+        <w:r>
+          <w:rPr>
+            <w:rStyle w:val="Hyperlink"/>
+            <w:rFonts w:ascii="Calibri" w:cs="Calibri" w:eastAsia="Calibri" w:hAnsi="Calibri"/>
+            <w:color w:val="1155CC"/>
+            <w:sz w:val="19"/>
+            <w:szCs w:val="19"/>
+            <w:u w:val="single"/>
+          </w:rPr>
+          <w:t xml:space="preserve">throughput CSV</w:t>
+        </w:r>
+      </w:hyperlink>
+      <w:r>
+        <w:rPr>
+          <w:rFonts w:ascii="Calibri" w:cs="Calibri" w:eastAsia="Calibri" w:hAnsi="Calibri"/>
+          <w:color w:val="52514E"/>
+          <w:sz w:val="19"/>
+          <w:szCs w:val="19"/>
+        </w:rPr>
+        <w:t xml:space="preserve">   ·   </w:t>
+      </w:r>
+      <w:hyperlink w:history="1" r:id="rIdcgdxvu6bbtcsnyvhhiht5">
+        <w:r>
+          <w:rPr>
+            <w:rStyle w:val="Hyperlink"/>
+            <w:rFonts w:ascii="Calibri" w:cs="Calibri" w:eastAsia="Calibri" w:hAnsi="Calibri"/>
+            <w:color w:val="1155CC"/>
+            <w:sz w:val="19"/>
+            <w:szCs w:val="19"/>
+            <w:u w:val="single"/>
+          </w:rPr>
+          <w:t xml:space="preserve">summary JSON</w:t>
+        </w:r>
+      </w:hyperlink>
+      <w:r>
+        <w:rPr>
+          <w:rFonts w:ascii="Calibri" w:cs="Calibri" w:eastAsia="Calibri" w:hAnsi="Calibri"/>
+          <w:color w:val="52514E"/>
+          <w:sz w:val="19"/>
+          <w:szCs w:val="19"/>
+        </w:rPr>
+        <w:t xml:space="preserve">   ·   </w:t>
+      </w:r>
+      <w:hyperlink w:history="1" r:id="rIdjfdqmbll3erxg4rcwgggo">
+        <w:r>
+          <w:rPr>
+            <w:rStyle w:val="Hyperlink"/>
+            <w:rFonts w:ascii="Calibri" w:cs="Calibri" w:eastAsia="Calibri" w:hAnsi="Calibri"/>
+            <w:color w:val="1155CC"/>
+            <w:sz w:val="19"/>
+            <w:szCs w:val="19"/>
+            <w:u w:val="single"/>
+          </w:rPr>
+          <w:t xml:space="preserve">figure</w:t>
+        </w:r>
+      </w:hyperlink>
+    </w:p>
+    <w:p>
+      <w:pPr>
         <w:spacing w:after="120" w:line="276"/>
       </w:pPr>
       <w:r>
@@ -10623,6 +11098,123 @@
       <w:r>
         <w:t xml:space="preserve">7. Part F: summary and analysis</w:t>
       </w:r>
+    </w:p>
+    <w:p>
+      <w:pPr>
+        <w:spacing w:after="200" w:line="276"/>
+      </w:pPr>
+      <w:r>
+        <w:rPr>
+          <w:rFonts w:ascii="Calibri" w:cs="Calibri" w:eastAsia="Calibri" w:hAnsi="Calibri"/>
+          <w:b/>
+          <w:bCs/>
+          <w:color w:val="52514E"/>
+          <w:sz w:val="19"/>
+          <w:szCs w:val="19"/>
+        </w:rPr>
+        <w:t xml:space="preserve">Code and artifacts:  </w:t>
+      </w:r>
+      <w:hyperlink w:history="1" r:id="rIdsdfll16ubhfy1_gltdti6">
+        <w:r>
+          <w:rPr>
+            <w:rStyle w:val="Hyperlink"/>
+            <w:rFonts w:ascii="Calibri" w:cs="Calibri" w:eastAsia="Calibri" w:hAnsi="Calibri"/>
+            <w:color w:val="1155CC"/>
+            <w:sz w:val="19"/>
+            <w:szCs w:val="19"/>
+            <w:u w:val="single"/>
+          </w:rPr>
+          <w:t xml:space="preserve">METRICS.md</w:t>
+        </w:r>
+      </w:hyperlink>
+      <w:r>
+        <w:rPr>
+          <w:rFonts w:ascii="Calibri" w:cs="Calibri" w:eastAsia="Calibri" w:hAnsi="Calibri"/>
+          <w:color w:val="52514E"/>
+          <w:sz w:val="19"/>
+          <w:szCs w:val="19"/>
+        </w:rPr>
+        <w:t xml:space="preserve">   ·   </w:t>
+      </w:r>
+      <w:hyperlink w:history="1" r:id="rIdz_b2amce-awrkuaemgduf">
+        <w:r>
+          <w:rPr>
+            <w:rStyle w:val="Hyperlink"/>
+            <w:rFonts w:ascii="Calibri" w:cs="Calibri" w:eastAsia="Calibri" w:hAnsi="Calibri"/>
+            <w:color w:val="1155CC"/>
+            <w:sz w:val="19"/>
+            <w:szCs w:val="19"/>
+            <w:u w:val="single"/>
+          </w:rPr>
+          <w:t xml:space="preserve">make_metrics.py</w:t>
+        </w:r>
+      </w:hyperlink>
+      <w:r>
+        <w:rPr>
+          <w:rFonts w:ascii="Calibri" w:cs="Calibri" w:eastAsia="Calibri" w:hAnsi="Calibri"/>
+          <w:color w:val="52514E"/>
+          <w:sz w:val="19"/>
+          <w:szCs w:val="19"/>
+        </w:rPr>
+        <w:t xml:space="preserve">   ·   </w:t>
+      </w:r>
+      <w:hyperlink w:history="1" r:id="rIdkqywwetlw4m9-ryl568s2">
+        <w:r>
+          <w:rPr>
+            <w:rStyle w:val="Hyperlink"/>
+            <w:rFonts w:ascii="Calibri" w:cs="Calibri" w:eastAsia="Calibri" w:hAnsi="Calibri"/>
+            <w:color w:val="1155CC"/>
+            <w:sz w:val="19"/>
+            <w:szCs w:val="19"/>
+            <w:u w:val="single"/>
+          </w:rPr>
+          <w:t xml:space="preserve">make_figures.py</w:t>
+        </w:r>
+      </w:hyperlink>
+      <w:r>
+        <w:rPr>
+          <w:rFonts w:ascii="Calibri" w:cs="Calibri" w:eastAsia="Calibri" w:hAnsi="Calibri"/>
+          <w:color w:val="52514E"/>
+          <w:sz w:val="19"/>
+          <w:szCs w:val="19"/>
+        </w:rPr>
+        <w:t xml:space="preserve">   ·   </w:t>
+      </w:r>
+      <w:hyperlink w:history="1" r:id="rId8cj53zzkd2oj3tzmlsyer">
+        <w:r>
+          <w:rPr>
+            <w:rStyle w:val="Hyperlink"/>
+            <w:rFonts w:ascii="Calibri" w:cs="Calibri" w:eastAsia="Calibri" w:hAnsi="Calibri"/>
+            <w:color w:val="1155CC"/>
+            <w:sz w:val="19"/>
+            <w:szCs w:val="19"/>
+            <w:u w:val="single"/>
+          </w:rPr>
+          <w:t xml:space="preserve">ANALYSIS.md</w:t>
+        </w:r>
+      </w:hyperlink>
+      <w:r>
+        <w:rPr>
+          <w:rFonts w:ascii="Calibri" w:cs="Calibri" w:eastAsia="Calibri" w:hAnsi="Calibri"/>
+          <w:color w:val="52514E"/>
+          <w:sz w:val="19"/>
+          <w:szCs w:val="19"/>
+        </w:rPr>
+        <w:t xml:space="preserve">   ·   </w:t>
+      </w:r>
+      <w:hyperlink w:history="1" r:id="rIdm3uvoeiiplhq8m9ets2er">
+        <w:r>
+          <w:rPr>
+            <w:rStyle w:val="Hyperlink"/>
+            <w:rFonts w:ascii="Calibri" w:cs="Calibri" w:eastAsia="Calibri" w:hAnsi="Calibri"/>
+            <w:color w:val="1155CC"/>
+            <w:sz w:val="19"/>
+            <w:szCs w:val="19"/>
+            <w:u w:val="single"/>
+          </w:rPr>
+          <w:t xml:space="preserve">RUN_LOG.txt</w:t>
+        </w:r>
+      </w:hyperlink>
     </w:p>
     <w:p>
       <w:pPr>
@@ -11481,6 +12073,35 @@
         <w:t xml:space="preserve">8. Reservation and GPU hours</w:t>
       </w:r>
     </w:p>
+    <w:p>
+      <w:pPr>
+        <w:spacing w:after="200" w:line="276"/>
+      </w:pPr>
+      <w:r>
+        <w:rPr>
+          <w:rFonts w:ascii="Calibri" w:cs="Calibri" w:eastAsia="Calibri" w:hAnsi="Calibri"/>
+          <w:b/>
+          <w:bCs/>
+          <w:color w:val="52514E"/>
+          <w:sz w:val="19"/>
+          <w:szCs w:val="19"/>
+        </w:rPr>
+        <w:t xml:space="preserve">Code and artifacts:  </w:t>
+      </w:r>
+      <w:hyperlink w:history="1" r:id="rId04wyaej_ij44y4wgtshvm">
+        <w:r>
+          <w:rPr>
+            <w:rStyle w:val="Hyperlink"/>
+            <w:rFonts w:ascii="Calibri" w:cs="Calibri" w:eastAsia="Calibri" w:hAnsi="Calibri"/>
+            <w:color w:val="1155CC"/>
+            <w:sz w:val="19"/>
+            <w:szCs w:val="19"/>
+            <w:u w:val="single"/>
+          </w:rPr>
+          <w:t xml:space="preserve">reservations.md</w:t>
+        </w:r>
+      </w:hyperlink>
+    </w:p>
     <w:tbl>
       <w:tblPr>
         <w:tblW w:type="dxa" w:w="9360"/>
@@ -11934,12 +12555,17 @@
       </w:r>
     </w:p>
     <w:p>
+      <w:r>
+        <w:br w:type="page"/>
+      </w:r>
+    </w:p>
+    <w:p>
       <w:pPr>
         <w:pStyle w:val="Heading1"/>
         <w:spacing w:after="160" w:before="320"/>
       </w:pPr>
       <w:r>
-        <w:t xml:space="preserve">9. Repository and AI use</w:t>
+        <w:t xml:space="preserve">9. Appendix: every committed file</w:t>
       </w:r>
     </w:p>
     <w:p>
@@ -11953,8 +12579,2179 @@
           <w:sz w:val="21"/>
           <w:szCs w:val="21"/>
         </w:rPr>
-        <w:t xml:space="preserve">All code, data, logs, figures and generated tables are committed at github.com/aneessaheba/DATA266 under GPU assignments/GPU Lab 1, tagged hw2-5. AI use is disclosed separately in AI_USE.md in that folder, following the same format as the previous assignments.</w:t>
+        <w:t xml:space="preserve">The complete submission is tagged hw2-5 at github.com/aneessaheba/DATA266 under GPU assignments/GPU Lab 1. Every file below is a live link into that tag, so each figure, table and claim in this report can be opened at source.</w:t>
       </w:r>
+    </w:p>
+    <w:tbl>
+      <w:tblPr>
+        <w:tblW w:type="dxa" w:w="9360"/>
+        <w:tblBorders>
+          <w:top w:val="single" w:color="auto" w:sz="4"/>
+          <w:left w:val="single" w:color="auto" w:sz="4"/>
+          <w:bottom w:val="single" w:color="auto" w:sz="4"/>
+          <w:right w:val="single" w:color="auto" w:sz="4"/>
+          <w:insideH w:val="single" w:color="auto" w:sz="4"/>
+          <w:insideV w:val="single" w:color="auto" w:sz="4"/>
+        </w:tblBorders>
+      </w:tblPr>
+      <w:tblGrid>
+        <w:gridCol w:w="4306"/>
+        <w:gridCol w:w="5054"/>
+      </w:tblGrid>
+      <w:tr>
+        <w:trPr>
+          <w:tblHeader/>
+        </w:trPr>
+        <w:tc>
+          <w:tcPr>
+            <w:tcW w:type="dxa" w:w="4306"/>
+            <w:shd w:fill="EFEFEC" w:color="auto" w:val="clear"/>
+            <w:tcMar>
+              <w:top w:type="dxa" w:w="60"/>
+              <w:left w:type="dxa" w:w="100"/>
+              <w:bottom w:type="dxa" w:w="60"/>
+              <w:right w:type="dxa" w:w="100"/>
+            </w:tcMar>
+          </w:tcPr>
+          <w:p>
+            <w:pPr>
+              <w:spacing w:after="0" w:line="240"/>
+            </w:pPr>
+            <w:r>
+              <w:rPr>
+                <w:rFonts w:ascii="Calibri" w:cs="Calibri" w:eastAsia="Calibri" w:hAnsi="Calibri"/>
+                <w:b/>
+                <w:bCs/>
+                <w:color w:val="1A1A1A"/>
+                <w:sz w:val="19"/>
+                <w:szCs w:val="19"/>
+              </w:rPr>
+              <w:t xml:space="preserve">File</w:t>
+            </w:r>
+          </w:p>
+        </w:tc>
+        <w:tc>
+          <w:tcPr>
+            <w:tcW w:type="dxa" w:w="5054"/>
+            <w:shd w:fill="EFEFEC" w:color="auto" w:val="clear"/>
+            <w:tcMar>
+              <w:top w:type="dxa" w:w="60"/>
+              <w:left w:type="dxa" w:w="100"/>
+              <w:bottom w:type="dxa" w:w="60"/>
+              <w:right w:type="dxa" w:w="100"/>
+            </w:tcMar>
+          </w:tcPr>
+          <w:p>
+            <w:pPr>
+              <w:spacing w:after="0" w:line="240"/>
+            </w:pPr>
+            <w:r>
+              <w:rPr>
+                <w:rFonts w:ascii="Calibri" w:cs="Calibri" w:eastAsia="Calibri" w:hAnsi="Calibri"/>
+                <w:b/>
+                <w:bCs/>
+                <w:color w:val="1A1A1A"/>
+                <w:sz w:val="19"/>
+                <w:szCs w:val="19"/>
+              </w:rPr>
+              <w:t xml:space="preserve">What it is</w:t>
+            </w:r>
+          </w:p>
+        </w:tc>
+      </w:tr>
+      <w:tr>
+        <w:tc>
+          <w:tcPr>
+            <w:tcW w:type="dxa" w:w="4306"/>
+            <w:tcMar>
+              <w:top w:type="dxa" w:w="60"/>
+              <w:left w:type="dxa" w:w="100"/>
+              <w:bottom w:type="dxa" w:w="60"/>
+              <w:right w:type="dxa" w:w="100"/>
+            </w:tcMar>
+          </w:tcPr>
+          <w:p>
+            <w:pPr>
+              <w:spacing w:after="0" w:line="240"/>
+            </w:pPr>
+            <w:hyperlink w:history="1" r:id="rIda0zsykhvqpjf6ro7trcdq">
+              <w:r>
+                <w:rPr>
+                  <w:rStyle w:val="Hyperlink"/>
+                  <w:rFonts w:ascii="Calibri" w:cs="Calibri" w:eastAsia="Calibri" w:hAnsi="Calibri"/>
+                  <w:color w:val="1155CC"/>
+                  <w:sz w:val="19"/>
+                  <w:szCs w:val="19"/>
+                  <w:u w:val="single"/>
+                </w:rPr>
+                <w:t xml:space="preserve">.gitignore</w:t>
+              </w:r>
+            </w:hyperlink>
+          </w:p>
+        </w:tc>
+        <w:tc>
+          <w:tcPr>
+            <w:tcW w:type="dxa" w:w="5054"/>
+            <w:tcMar>
+              <w:top w:type="dxa" w:w="60"/>
+              <w:left w:type="dxa" w:w="100"/>
+              <w:bottom w:type="dxa" w:w="60"/>
+              <w:right w:type="dxa" w:w="100"/>
+            </w:tcMar>
+          </w:tcPr>
+          <w:p>
+            <w:pPr>
+              <w:spacing w:after="0" w:line="240"/>
+            </w:pPr>
+            <w:r>
+              <w:rPr>
+                <w:rFonts w:ascii="Calibri" w:cs="Calibri" w:eastAsia="Calibri" w:hAnsi="Calibri"/>
+                <w:b w:val="false"/>
+                <w:bCs w:val="false"/>
+                <w:color w:val="1A1A1A"/>
+                <w:sz w:val="19"/>
+                <w:szCs w:val="19"/>
+              </w:rPr>
+              <w:t xml:space="preserve">ignore rules, outputs are deliberately not ignored</w:t>
+            </w:r>
+          </w:p>
+        </w:tc>
+      </w:tr>
+      <w:tr>
+        <w:tc>
+          <w:tcPr>
+            <w:tcW w:type="dxa" w:w="4306"/>
+            <w:tcMar>
+              <w:top w:type="dxa" w:w="60"/>
+              <w:left w:type="dxa" w:w="100"/>
+              <w:bottom w:type="dxa" w:w="60"/>
+              <w:right w:type="dxa" w:w="100"/>
+            </w:tcMar>
+          </w:tcPr>
+          <w:p>
+            <w:pPr>
+              <w:spacing w:after="0" w:line="240"/>
+            </w:pPr>
+            <w:hyperlink w:history="1" r:id="rIdmwpqp9nzmvcxkhcbunyhl">
+              <w:r>
+                <w:rPr>
+                  <w:rStyle w:val="Hyperlink"/>
+                  <w:rFonts w:ascii="Calibri" w:cs="Calibri" w:eastAsia="Calibri" w:hAnsi="Calibri"/>
+                  <w:color w:val="1155CC"/>
+                  <w:sz w:val="19"/>
+                  <w:szCs w:val="19"/>
+                  <w:u w:val="single"/>
+                </w:rPr>
+                <w:t xml:space="preserve">AI_USE.md</w:t>
+              </w:r>
+            </w:hyperlink>
+          </w:p>
+        </w:tc>
+        <w:tc>
+          <w:tcPr>
+            <w:tcW w:type="dxa" w:w="5054"/>
+            <w:tcMar>
+              <w:top w:type="dxa" w:w="60"/>
+              <w:left w:type="dxa" w:w="100"/>
+              <w:bottom w:type="dxa" w:w="60"/>
+              <w:right w:type="dxa" w:w="100"/>
+            </w:tcMar>
+          </w:tcPr>
+          <w:p>
+            <w:pPr>
+              <w:spacing w:after="0" w:line="240"/>
+            </w:pPr>
+            <w:r>
+              <w:rPr>
+                <w:rFonts w:ascii="Calibri" w:cs="Calibri" w:eastAsia="Calibri" w:hAnsi="Calibri"/>
+                <w:b w:val="false"/>
+                <w:bCs w:val="false"/>
+                <w:color w:val="1A1A1A"/>
+                <w:sz w:val="19"/>
+                <w:szCs w:val="19"/>
+              </w:rPr>
+              <w:t xml:space="preserve">AI use disclosure</w:t>
+            </w:r>
+          </w:p>
+        </w:tc>
+      </w:tr>
+      <w:tr>
+        <w:tc>
+          <w:tcPr>
+            <w:tcW w:type="dxa" w:w="4306"/>
+            <w:tcMar>
+              <w:top w:type="dxa" w:w="60"/>
+              <w:left w:type="dxa" w:w="100"/>
+              <w:bottom w:type="dxa" w:w="60"/>
+              <w:right w:type="dxa" w:w="100"/>
+            </w:tcMar>
+          </w:tcPr>
+          <w:p>
+            <w:pPr>
+              <w:spacing w:after="0" w:line="240"/>
+            </w:pPr>
+            <w:hyperlink w:history="1" r:id="rIdgudq9-my7w3hg8mvjd2d1">
+              <w:r>
+                <w:rPr>
+                  <w:rStyle w:val="Hyperlink"/>
+                  <w:rFonts w:ascii="Calibri" w:cs="Calibri" w:eastAsia="Calibri" w:hAnsi="Calibri"/>
+                  <w:color w:val="1155CC"/>
+                  <w:sz w:val="19"/>
+                  <w:szCs w:val="19"/>
+                  <w:u w:val="single"/>
+                </w:rPr>
+                <w:t xml:space="preserve">ANALYSIS.md</w:t>
+              </w:r>
+            </w:hyperlink>
+          </w:p>
+        </w:tc>
+        <w:tc>
+          <w:tcPr>
+            <w:tcW w:type="dxa" w:w="5054"/>
+            <w:tcMar>
+              <w:top w:type="dxa" w:w="60"/>
+              <w:left w:type="dxa" w:w="100"/>
+              <w:bottom w:type="dxa" w:w="60"/>
+              <w:right w:type="dxa" w:w="100"/>
+            </w:tcMar>
+          </w:tcPr>
+          <w:p>
+            <w:pPr>
+              <w:spacing w:after="0" w:line="240"/>
+            </w:pPr>
+            <w:r>
+              <w:rPr>
+                <w:rFonts w:ascii="Calibri" w:cs="Calibri" w:eastAsia="Calibri" w:hAnsi="Calibri"/>
+                <w:b w:val="false"/>
+                <w:bCs w:val="false"/>
+                <w:color w:val="1A1A1A"/>
+                <w:sz w:val="19"/>
+                <w:szCs w:val="19"/>
+              </w:rPr>
+              <w:t xml:space="preserve">written answers for Parts B, D and F</w:t>
+            </w:r>
+          </w:p>
+        </w:tc>
+      </w:tr>
+      <w:tr>
+        <w:tc>
+          <w:tcPr>
+            <w:tcW w:type="dxa" w:w="4306"/>
+            <w:tcMar>
+              <w:top w:type="dxa" w:w="60"/>
+              <w:left w:type="dxa" w:w="100"/>
+              <w:bottom w:type="dxa" w:w="60"/>
+              <w:right w:type="dxa" w:w="100"/>
+            </w:tcMar>
+          </w:tcPr>
+          <w:p>
+            <w:pPr>
+              <w:spacing w:after="0" w:line="240"/>
+            </w:pPr>
+            <w:hyperlink w:history="1" r:id="rIdp-z8qvxfruxdp5kbj1ziw">
+              <w:r>
+                <w:rPr>
+                  <w:rStyle w:val="Hyperlink"/>
+                  <w:rFonts w:ascii="Calibri" w:cs="Calibri" w:eastAsia="Calibri" w:hAnsi="Calibri"/>
+                  <w:color w:val="1155CC"/>
+                  <w:sz w:val="19"/>
+                  <w:szCs w:val="19"/>
+                  <w:u w:val="single"/>
+                </w:rPr>
+                <w:t xml:space="preserve">ASSIGNMENT.md</w:t>
+              </w:r>
+            </w:hyperlink>
+          </w:p>
+        </w:tc>
+        <w:tc>
+          <w:tcPr>
+            <w:tcW w:type="dxa" w:w="5054"/>
+            <w:tcMar>
+              <w:top w:type="dxa" w:w="60"/>
+              <w:left w:type="dxa" w:w="100"/>
+              <w:bottom w:type="dxa" w:w="60"/>
+              <w:right w:type="dxa" w:w="100"/>
+            </w:tcMar>
+          </w:tcPr>
+          <w:p>
+            <w:pPr>
+              <w:spacing w:after="0" w:line="240"/>
+            </w:pPr>
+            <w:r>
+              <w:rPr>
+                <w:rFonts w:ascii="Calibri" w:cs="Calibri" w:eastAsia="Calibri" w:hAnsi="Calibri"/>
+                <w:b w:val="false"/>
+                <w:bCs w:val="false"/>
+                <w:color w:val="1A1A1A"/>
+                <w:sz w:val="19"/>
+                <w:szCs w:val="19"/>
+              </w:rPr>
+              <w:t xml:space="preserve">the assignment brief as given</w:t>
+            </w:r>
+          </w:p>
+        </w:tc>
+      </w:tr>
+      <w:tr>
+        <w:tc>
+          <w:tcPr>
+            <w:tcW w:type="dxa" w:w="4306"/>
+            <w:tcMar>
+              <w:top w:type="dxa" w:w="60"/>
+              <w:left w:type="dxa" w:w="100"/>
+              <w:bottom w:type="dxa" w:w="60"/>
+              <w:right w:type="dxa" w:w="100"/>
+            </w:tcMar>
+          </w:tcPr>
+          <w:p>
+            <w:pPr>
+              <w:spacing w:after="0" w:line="240"/>
+            </w:pPr>
+            <w:hyperlink w:history="1" r:id="rId0evowqifoh9337cycoyzv">
+              <w:r>
+                <w:rPr>
+                  <w:rStyle w:val="Hyperlink"/>
+                  <w:rFonts w:ascii="Calibri" w:cs="Calibri" w:eastAsia="Calibri" w:hAnsi="Calibri"/>
+                  <w:color w:val="1155CC"/>
+                  <w:sz w:val="19"/>
+                  <w:szCs w:val="19"/>
+                  <w:u w:val="single"/>
+                </w:rPr>
+                <w:t xml:space="preserve">HW2.5_Document.docx</w:t>
+              </w:r>
+            </w:hyperlink>
+          </w:p>
+        </w:tc>
+        <w:tc>
+          <w:tcPr>
+            <w:tcW w:type="dxa" w:w="5054"/>
+            <w:tcMar>
+              <w:top w:type="dxa" w:w="60"/>
+              <w:left w:type="dxa" w:w="100"/>
+              <w:bottom w:type="dxa" w:w="60"/>
+              <w:right w:type="dxa" w:w="100"/>
+            </w:tcMar>
+          </w:tcPr>
+          <w:p>
+            <w:pPr>
+              <w:spacing w:after="0" w:line="240"/>
+            </w:pPr>
+            <w:r>
+              <w:rPr>
+                <w:rFonts w:ascii="Calibri" w:cs="Calibri" w:eastAsia="Calibri" w:hAnsi="Calibri"/>
+                <w:b w:val="false"/>
+                <w:bCs w:val="false"/>
+                <w:color w:val="1A1A1A"/>
+                <w:sz w:val="19"/>
+                <w:szCs w:val="19"/>
+              </w:rPr>
+              <w:t xml:space="preserve">this report</w:t>
+            </w:r>
+          </w:p>
+        </w:tc>
+      </w:tr>
+      <w:tr>
+        <w:tc>
+          <w:tcPr>
+            <w:tcW w:type="dxa" w:w="4306"/>
+            <w:tcMar>
+              <w:top w:type="dxa" w:w="60"/>
+              <w:left w:type="dxa" w:w="100"/>
+              <w:bottom w:type="dxa" w:w="60"/>
+              <w:right w:type="dxa" w:w="100"/>
+            </w:tcMar>
+          </w:tcPr>
+          <w:p>
+            <w:pPr>
+              <w:spacing w:after="0" w:line="240"/>
+            </w:pPr>
+            <w:hyperlink w:history="1" r:id="rIdkaiyay9dxcglcuor5q8i8">
+              <w:r>
+                <w:rPr>
+                  <w:rStyle w:val="Hyperlink"/>
+                  <w:rFonts w:ascii="Calibri" w:cs="Calibri" w:eastAsia="Calibri" w:hAnsi="Calibri"/>
+                  <w:color w:val="1155CC"/>
+                  <w:sz w:val="19"/>
+                  <w:szCs w:val="19"/>
+                  <w:u w:val="single"/>
+                </w:rPr>
+                <w:t xml:space="preserve">METRICS.md</w:t>
+              </w:r>
+            </w:hyperlink>
+          </w:p>
+        </w:tc>
+        <w:tc>
+          <w:tcPr>
+            <w:tcW w:type="dxa" w:w="5054"/>
+            <w:tcMar>
+              <w:top w:type="dxa" w:w="60"/>
+              <w:left w:type="dxa" w:w="100"/>
+              <w:bottom w:type="dxa" w:w="60"/>
+              <w:right w:type="dxa" w:w="100"/>
+            </w:tcMar>
+          </w:tcPr>
+          <w:p>
+            <w:pPr>
+              <w:spacing w:after="0" w:line="240"/>
+            </w:pPr>
+            <w:r>
+              <w:rPr>
+                <w:rFonts w:ascii="Calibri" w:cs="Calibri" w:eastAsia="Calibri" w:hAnsi="Calibri"/>
+                <w:b w:val="false"/>
+                <w:bCs w:val="false"/>
+                <w:color w:val="1A1A1A"/>
+                <w:sz w:val="19"/>
+                <w:szCs w:val="19"/>
+              </w:rPr>
+              <w:t xml:space="preserve">generated, Table HW2.5.1 and the per part detail tables</w:t>
+            </w:r>
+          </w:p>
+        </w:tc>
+      </w:tr>
+      <w:tr>
+        <w:tc>
+          <w:tcPr>
+            <w:tcW w:type="dxa" w:w="4306"/>
+            <w:tcMar>
+              <w:top w:type="dxa" w:w="60"/>
+              <w:left w:type="dxa" w:w="100"/>
+              <w:bottom w:type="dxa" w:w="60"/>
+              <w:right w:type="dxa" w:w="100"/>
+            </w:tcMar>
+          </w:tcPr>
+          <w:p>
+            <w:pPr>
+              <w:spacing w:after="0" w:line="240"/>
+            </w:pPr>
+            <w:hyperlink w:history="1" r:id="rId5ybbslgf4fe6-nf4ui38o">
+              <w:r>
+                <w:rPr>
+                  <w:rStyle w:val="Hyperlink"/>
+                  <w:rFonts w:ascii="Calibri" w:cs="Calibri" w:eastAsia="Calibri" w:hAnsi="Calibri"/>
+                  <w:color w:val="1155CC"/>
+                  <w:sz w:val="19"/>
+                  <w:szCs w:val="19"/>
+                  <w:u w:val="single"/>
+                </w:rPr>
+                <w:t xml:space="preserve">README.md</w:t>
+              </w:r>
+            </w:hyperlink>
+          </w:p>
+        </w:tc>
+        <w:tc>
+          <w:tcPr>
+            <w:tcW w:type="dxa" w:w="5054"/>
+            <w:tcMar>
+              <w:top w:type="dxa" w:w="60"/>
+              <w:left w:type="dxa" w:w="100"/>
+              <w:bottom w:type="dxa" w:w="60"/>
+              <w:right w:type="dxa" w:w="100"/>
+            </w:tcMar>
+          </w:tcPr>
+          <w:p>
+            <w:pPr>
+              <w:spacing w:after="0" w:line="240"/>
+            </w:pPr>
+            <w:r>
+              <w:rPr>
+                <w:rFonts w:ascii="Calibri" w:cs="Calibri" w:eastAsia="Calibri" w:hAnsi="Calibri"/>
+                <w:b w:val="false"/>
+                <w:bCs w:val="false"/>
+                <w:color w:val="1A1A1A"/>
+                <w:sz w:val="19"/>
+                <w:szCs w:val="19"/>
+              </w:rPr>
+              <w:t xml:space="preserve">repository layout and how to reproduce</w:t>
+            </w:r>
+          </w:p>
+        </w:tc>
+      </w:tr>
+      <w:tr>
+        <w:tc>
+          <w:tcPr>
+            <w:tcW w:type="dxa" w:w="4306"/>
+            <w:tcMar>
+              <w:top w:type="dxa" w:w="60"/>
+              <w:left w:type="dxa" w:w="100"/>
+              <w:bottom w:type="dxa" w:w="60"/>
+              <w:right w:type="dxa" w:w="100"/>
+            </w:tcMar>
+          </w:tcPr>
+          <w:p>
+            <w:pPr>
+              <w:spacing w:after="0" w:line="240"/>
+            </w:pPr>
+            <w:hyperlink w:history="1" r:id="rIdc-upf3qclsnv5paqhjmsa">
+              <w:r>
+                <w:rPr>
+                  <w:rStyle w:val="Hyperlink"/>
+                  <w:rFonts w:ascii="Calibri" w:cs="Calibri" w:eastAsia="Calibri" w:hAnsi="Calibri"/>
+                  <w:color w:val="1155CC"/>
+                  <w:sz w:val="19"/>
+                  <w:szCs w:val="19"/>
+                  <w:u w:val="single"/>
+                </w:rPr>
+                <w:t xml:space="preserve">RUN_LOG.txt</w:t>
+              </w:r>
+            </w:hyperlink>
+          </w:p>
+        </w:tc>
+        <w:tc>
+          <w:tcPr>
+            <w:tcW w:type="dxa" w:w="5054"/>
+            <w:tcMar>
+              <w:top w:type="dxa" w:w="60"/>
+              <w:left w:type="dxa" w:w="100"/>
+              <w:bottom w:type="dxa" w:w="60"/>
+              <w:right w:type="dxa" w:w="100"/>
+            </w:tcMar>
+          </w:tcPr>
+          <w:p>
+            <w:pPr>
+              <w:spacing w:after="0" w:line="240"/>
+            </w:pPr>
+            <w:r>
+              <w:rPr>
+                <w:rFonts w:ascii="Calibri" w:cs="Calibri" w:eastAsia="Calibri" w:hAnsi="Calibri"/>
+                <w:b w:val="false"/>
+                <w:bCs w:val="false"/>
+                <w:color w:val="1A1A1A"/>
+                <w:sz w:val="19"/>
+                <w:szCs w:val="19"/>
+              </w:rPr>
+              <w:t xml:space="preserve">append only UUID labelled trace of every run</w:t>
+            </w:r>
+          </w:p>
+        </w:tc>
+      </w:tr>
+      <w:tr>
+        <w:tc>
+          <w:tcPr>
+            <w:tcW w:type="dxa" w:w="4306"/>
+            <w:tcMar>
+              <w:top w:type="dxa" w:w="60"/>
+              <w:left w:type="dxa" w:w="100"/>
+              <w:bottom w:type="dxa" w:w="60"/>
+              <w:right w:type="dxa" w:w="100"/>
+            </w:tcMar>
+          </w:tcPr>
+          <w:p>
+            <w:pPr>
+              <w:spacing w:after="0" w:line="240"/>
+            </w:pPr>
+            <w:hyperlink w:history="1" r:id="rIdgomspu4gnwogfoolfv1qz">
+              <w:r>
+                <w:rPr>
+                  <w:rStyle w:val="Hyperlink"/>
+                  <w:rFonts w:ascii="Calibri" w:cs="Calibri" w:eastAsia="Calibri" w:hAnsi="Calibri"/>
+                  <w:color w:val="1155CC"/>
+                  <w:sz w:val="19"/>
+                  <w:szCs w:val="19"/>
+                  <w:u w:val="single"/>
+                </w:rPr>
+                <w:t xml:space="preserve">data/part_a_identity_74396ae57bdb.json</w:t>
+              </w:r>
+            </w:hyperlink>
+          </w:p>
+        </w:tc>
+        <w:tc>
+          <w:tcPr>
+            <w:tcW w:type="dxa" w:w="5054"/>
+            <w:tcMar>
+              <w:top w:type="dxa" w:w="60"/>
+              <w:left w:type="dxa" w:w="100"/>
+              <w:bottom w:type="dxa" w:w="60"/>
+              <w:right w:type="dxa" w:w="100"/>
+            </w:tcMar>
+          </w:tcPr>
+          <w:p>
+            <w:pPr>
+              <w:spacing w:after="0" w:line="240"/>
+            </w:pPr>
+            <w:r>
+              <w:rPr>
+                <w:rFonts w:ascii="Calibri" w:cs="Calibri" w:eastAsia="Calibri" w:hAnsi="Calibri"/>
+                <w:b w:val="false"/>
+                <w:bCs w:val="false"/>
+                <w:color w:val="1A1A1A"/>
+                <w:sz w:val="19"/>
+                <w:szCs w:val="19"/>
+              </w:rPr>
+              <w:t xml:space="preserve">Part A card identity and vendor spec</w:t>
+            </w:r>
+          </w:p>
+        </w:tc>
+      </w:tr>
+      <w:tr>
+        <w:tc>
+          <w:tcPr>
+            <w:tcW w:type="dxa" w:w="4306"/>
+            <w:tcMar>
+              <w:top w:type="dxa" w:w="60"/>
+              <w:left w:type="dxa" w:w="100"/>
+              <w:bottom w:type="dxa" w:w="60"/>
+              <w:right w:type="dxa" w:w="100"/>
+            </w:tcMar>
+          </w:tcPr>
+          <w:p>
+            <w:pPr>
+              <w:spacing w:after="0" w:line="240"/>
+            </w:pPr>
+            <w:hyperlink w:history="1" r:id="rId8ekywmew5m3yvs5lucxwp">
+              <w:r>
+                <w:rPr>
+                  <w:rStyle w:val="Hyperlink"/>
+                  <w:rFonts w:ascii="Calibri" w:cs="Calibri" w:eastAsia="Calibri" w:hAnsi="Calibri"/>
+                  <w:color w:val="1155CC"/>
+                  <w:sz w:val="19"/>
+                  <w:szCs w:val="19"/>
+                  <w:u w:val="single"/>
+                </w:rPr>
+                <w:t xml:space="preserve">data/part_b_74396ae57bdb.csv</w:t>
+              </w:r>
+            </w:hyperlink>
+          </w:p>
+        </w:tc>
+        <w:tc>
+          <w:tcPr>
+            <w:tcW w:type="dxa" w:w="5054"/>
+            <w:tcMar>
+              <w:top w:type="dxa" w:w="60"/>
+              <w:left w:type="dxa" w:w="100"/>
+              <w:bottom w:type="dxa" w:w="60"/>
+              <w:right w:type="dxa" w:w="100"/>
+            </w:tcMar>
+          </w:tcPr>
+          <w:p>
+            <w:pPr>
+              <w:spacing w:after="0" w:line="240"/>
+            </w:pPr>
+            <w:r>
+              <w:rPr>
+                <w:rFonts w:ascii="Calibri" w:cs="Calibri" w:eastAsia="Calibri" w:hAnsi="Calibri"/>
+                <w:b w:val="false"/>
+                <w:bCs w:val="false"/>
+                <w:color w:val="1A1A1A"/>
+                <w:sz w:val="19"/>
+                <w:szCs w:val="19"/>
+              </w:rPr>
+              <w:t xml:space="preserve">Part B, 20 timed configurations</w:t>
+            </w:r>
+          </w:p>
+        </w:tc>
+      </w:tr>
+      <w:tr>
+        <w:tc>
+          <w:tcPr>
+            <w:tcW w:type="dxa" w:w="4306"/>
+            <w:tcMar>
+              <w:top w:type="dxa" w:w="60"/>
+              <w:left w:type="dxa" w:w="100"/>
+              <w:bottom w:type="dxa" w:w="60"/>
+              <w:right w:type="dxa" w:w="100"/>
+            </w:tcMar>
+          </w:tcPr>
+          <w:p>
+            <w:pPr>
+              <w:spacing w:after="0" w:line="240"/>
+            </w:pPr>
+            <w:hyperlink w:history="1" r:id="rIdnhinqyrsting9cslwy-xh">
+              <w:r>
+                <w:rPr>
+                  <w:rStyle w:val="Hyperlink"/>
+                  <w:rFonts w:ascii="Calibri" w:cs="Calibri" w:eastAsia="Calibri" w:hAnsi="Calibri"/>
+                  <w:color w:val="1155CC"/>
+                  <w:sz w:val="19"/>
+                  <w:szCs w:val="19"/>
+                  <w:u w:val="single"/>
+                </w:rPr>
+                <w:t xml:space="preserve">data/part_c_74396ae57bdb.csv</w:t>
+              </w:r>
+            </w:hyperlink>
+          </w:p>
+        </w:tc>
+        <w:tc>
+          <w:tcPr>
+            <w:tcW w:type="dxa" w:w="5054"/>
+            <w:tcMar>
+              <w:top w:type="dxa" w:w="60"/>
+              <w:left w:type="dxa" w:w="100"/>
+              <w:bottom w:type="dxa" w:w="60"/>
+              <w:right w:type="dxa" w:w="100"/>
+            </w:tcMar>
+          </w:tcPr>
+          <w:p>
+            <w:pPr>
+              <w:spacing w:after="0" w:line="240"/>
+            </w:pPr>
+            <w:r>
+              <w:rPr>
+                <w:rFonts w:ascii="Calibri" w:cs="Calibri" w:eastAsia="Calibri" w:hAnsi="Calibri"/>
+                <w:b w:val="false"/>
+                <w:bCs w:val="false"/>
+                <w:color w:val="1A1A1A"/>
+                <w:sz w:val="19"/>
+                <w:szCs w:val="19"/>
+              </w:rPr>
+              <w:t xml:space="preserve">Part C, three operations with roofline placement</w:t>
+            </w:r>
+          </w:p>
+        </w:tc>
+      </w:tr>
+      <w:tr>
+        <w:tc>
+          <w:tcPr>
+            <w:tcW w:type="dxa" w:w="4306"/>
+            <w:tcMar>
+              <w:top w:type="dxa" w:w="60"/>
+              <w:left w:type="dxa" w:w="100"/>
+              <w:bottom w:type="dxa" w:w="60"/>
+              <w:right w:type="dxa" w:w="100"/>
+            </w:tcMar>
+          </w:tcPr>
+          <w:p>
+            <w:pPr>
+              <w:spacing w:after="0" w:line="240"/>
+            </w:pPr>
+            <w:hyperlink w:history="1" r:id="rIduhep5w6zep_paqnleuvs1">
+              <w:r>
+                <w:rPr>
+                  <w:rStyle w:val="Hyperlink"/>
+                  <w:rFonts w:ascii="Calibri" w:cs="Calibri" w:eastAsia="Calibri" w:hAnsi="Calibri"/>
+                  <w:color w:val="1155CC"/>
+                  <w:sz w:val="19"/>
+                  <w:szCs w:val="19"/>
+                  <w:u w:val="single"/>
+                </w:rPr>
+                <w:t xml:space="preserve">data/part_d_74396ae57bdb.csv</w:t>
+              </w:r>
+            </w:hyperlink>
+          </w:p>
+        </w:tc>
+        <w:tc>
+          <w:tcPr>
+            <w:tcW w:type="dxa" w:w="5054"/>
+            <w:tcMar>
+              <w:top w:type="dxa" w:w="60"/>
+              <w:left w:type="dxa" w:w="100"/>
+              <w:bottom w:type="dxa" w:w="60"/>
+              <w:right w:type="dxa" w:w="100"/>
+            </w:tcMar>
+          </w:tcPr>
+          <w:p>
+            <w:pPr>
+              <w:spacing w:after="0" w:line="240"/>
+            </w:pPr>
+            <w:r>
+              <w:rPr>
+                <w:rFonts w:ascii="Calibri" w:cs="Calibri" w:eastAsia="Calibri" w:hAnsi="Calibri"/>
+                <w:b w:val="false"/>
+                <w:bCs w:val="false"/>
+                <w:color w:val="1A1A1A"/>
+                <w:sz w:val="19"/>
+                <w:szCs w:val="19"/>
+              </w:rPr>
+              <w:t xml:space="preserve">Part D, sweep, extension and bisection probes</w:t>
+            </w:r>
+          </w:p>
+        </w:tc>
+      </w:tr>
+      <w:tr>
+        <w:tc>
+          <w:tcPr>
+            <w:tcW w:type="dxa" w:w="4306"/>
+            <w:tcMar>
+              <w:top w:type="dxa" w:w="60"/>
+              <w:left w:type="dxa" w:w="100"/>
+              <w:bottom w:type="dxa" w:w="60"/>
+              <w:right w:type="dxa" w:w="100"/>
+            </w:tcMar>
+          </w:tcPr>
+          <w:p>
+            <w:pPr>
+              <w:spacing w:after="0" w:line="240"/>
+            </w:pPr>
+            <w:hyperlink w:history="1" r:id="rIdrx3-5hubcliaz8dxemajr">
+              <w:r>
+                <w:rPr>
+                  <w:rStyle w:val="Hyperlink"/>
+                  <w:rFonts w:ascii="Calibri" w:cs="Calibri" w:eastAsia="Calibri" w:hAnsi="Calibri"/>
+                  <w:color w:val="1155CC"/>
+                  <w:sz w:val="19"/>
+                  <w:szCs w:val="19"/>
+                  <w:u w:val="single"/>
+                </w:rPr>
+                <w:t xml:space="preserve">data/part_d_summary_74396ae57bdb.json</w:t>
+              </w:r>
+            </w:hyperlink>
+          </w:p>
+        </w:tc>
+        <w:tc>
+          <w:tcPr>
+            <w:tcW w:type="dxa" w:w="5054"/>
+            <w:tcMar>
+              <w:top w:type="dxa" w:w="60"/>
+              <w:left w:type="dxa" w:w="100"/>
+              <w:bottom w:type="dxa" w:w="60"/>
+              <w:right w:type="dxa" w:w="100"/>
+            </w:tcMar>
+          </w:tcPr>
+          <w:p>
+            <w:pPr>
+              <w:spacing w:after="0" w:line="240"/>
+            </w:pPr>
+            <w:r>
+              <w:rPr>
+                <w:rFonts w:ascii="Calibri" w:cs="Calibri" w:eastAsia="Calibri" w:hAnsi="Calibri"/>
+                <w:b w:val="false"/>
+                <w:bCs w:val="false"/>
+                <w:color w:val="1A1A1A"/>
+                <w:sz w:val="19"/>
+                <w:szCs w:val="19"/>
+              </w:rPr>
+              <w:t xml:space="preserve">Part D, OOM brackets and quadratic fits</w:t>
+            </w:r>
+          </w:p>
+        </w:tc>
+      </w:tr>
+      <w:tr>
+        <w:tc>
+          <w:tcPr>
+            <w:tcW w:type="dxa" w:w="4306"/>
+            <w:tcMar>
+              <w:top w:type="dxa" w:w="60"/>
+              <w:left w:type="dxa" w:w="100"/>
+              <w:bottom w:type="dxa" w:w="60"/>
+              <w:right w:type="dxa" w:w="100"/>
+            </w:tcMar>
+          </w:tcPr>
+          <w:p>
+            <w:pPr>
+              <w:spacing w:after="0" w:line="240"/>
+            </w:pPr>
+            <w:hyperlink w:history="1" r:id="rIdeffixiyciwxfm-gue94qv">
+              <w:r>
+                <w:rPr>
+                  <w:rStyle w:val="Hyperlink"/>
+                  <w:rFonts w:ascii="Calibri" w:cs="Calibri" w:eastAsia="Calibri" w:hAnsi="Calibri"/>
+                  <w:color w:val="1155CC"/>
+                  <w:sz w:val="19"/>
+                  <w:szCs w:val="19"/>
+                  <w:u w:val="single"/>
+                </w:rPr>
+                <w:t xml:space="preserve">data/part_e_summary_74396ae57bdb.json</w:t>
+              </w:r>
+            </w:hyperlink>
+          </w:p>
+        </w:tc>
+        <w:tc>
+          <w:tcPr>
+            <w:tcW w:type="dxa" w:w="5054"/>
+            <w:tcMar>
+              <w:top w:type="dxa" w:w="60"/>
+              <w:left w:type="dxa" w:w="100"/>
+              <w:bottom w:type="dxa" w:w="60"/>
+              <w:right w:type="dxa" w:w="100"/>
+            </w:tcMar>
+          </w:tcPr>
+          <w:p>
+            <w:pPr>
+              <w:spacing w:after="0" w:line="240"/>
+            </w:pPr>
+            <w:r>
+              <w:rPr>
+                <w:rFonts w:ascii="Calibri" w:cs="Calibri" w:eastAsia="Calibri" w:hAnsi="Calibri"/>
+                <w:b w:val="false"/>
+                <w:bCs w:val="false"/>
+                <w:color w:val="1A1A1A"/>
+                <w:sz w:val="19"/>
+                <w:szCs w:val="19"/>
+              </w:rPr>
+              <w:t xml:space="preserve">Part E, peak against steady state</w:t>
+            </w:r>
+          </w:p>
+        </w:tc>
+      </w:tr>
+      <w:tr>
+        <w:tc>
+          <w:tcPr>
+            <w:tcW w:type="dxa" w:w="4306"/>
+            <w:tcMar>
+              <w:top w:type="dxa" w:w="60"/>
+              <w:left w:type="dxa" w:w="100"/>
+              <w:bottom w:type="dxa" w:w="60"/>
+              <w:right w:type="dxa" w:w="100"/>
+            </w:tcMar>
+          </w:tcPr>
+          <w:p>
+            <w:pPr>
+              <w:spacing w:after="0" w:line="240"/>
+            </w:pPr>
+            <w:hyperlink w:history="1" r:id="rId6s4of_vbaixxmelurlxak">
+              <w:r>
+                <w:rPr>
+                  <w:rStyle w:val="Hyperlink"/>
+                  <w:rFonts w:ascii="Calibri" w:cs="Calibri" w:eastAsia="Calibri" w:hAnsi="Calibri"/>
+                  <w:color w:val="1155CC"/>
+                  <w:sz w:val="19"/>
+                  <w:szCs w:val="19"/>
+                  <w:u w:val="single"/>
+                </w:rPr>
+                <w:t xml:space="preserve">data/part_e_throughput_74396ae57bdb.csv</w:t>
+              </w:r>
+            </w:hyperlink>
+          </w:p>
+        </w:tc>
+        <w:tc>
+          <w:tcPr>
+            <w:tcW w:type="dxa" w:w="5054"/>
+            <w:tcMar>
+              <w:top w:type="dxa" w:w="60"/>
+              <w:left w:type="dxa" w:w="100"/>
+              <w:bottom w:type="dxa" w:w="60"/>
+              <w:right w:type="dxa" w:w="100"/>
+            </w:tcMar>
+          </w:tcPr>
+          <w:p>
+            <w:pPr>
+              <w:spacing w:after="0" w:line="240"/>
+            </w:pPr>
+            <w:r>
+              <w:rPr>
+                <w:rFonts w:ascii="Calibri" w:cs="Calibri" w:eastAsia="Calibri" w:hAnsi="Calibri"/>
+                <w:b w:val="false"/>
+                <w:bCs w:val="false"/>
+                <w:color w:val="1A1A1A"/>
+                <w:sz w:val="19"/>
+                <w:szCs w:val="19"/>
+              </w:rPr>
+              <w:t xml:space="preserve">Part E, throughput samples across the run</w:t>
+            </w:r>
+          </w:p>
+        </w:tc>
+      </w:tr>
+      <w:tr>
+        <w:tc>
+          <w:tcPr>
+            <w:tcW w:type="dxa" w:w="4306"/>
+            <w:tcMar>
+              <w:top w:type="dxa" w:w="60"/>
+              <w:left w:type="dxa" w:w="100"/>
+              <w:bottom w:type="dxa" w:w="60"/>
+              <w:right w:type="dxa" w:w="100"/>
+            </w:tcMar>
+          </w:tcPr>
+          <w:p>
+            <w:pPr>
+              <w:spacing w:after="0" w:line="240"/>
+            </w:pPr>
+            <w:hyperlink w:history="1" r:id="rIde-qll4gjz-736h9jbeg9s">
+              <w:r>
+                <w:rPr>
+                  <w:rStyle w:val="Hyperlink"/>
+                  <w:rFonts w:ascii="Calibri" w:cs="Calibri" w:eastAsia="Calibri" w:hAnsi="Calibri"/>
+                  <w:color w:val="1155CC"/>
+                  <w:sz w:val="19"/>
+                  <w:szCs w:val="19"/>
+                  <w:u w:val="single"/>
+                </w:rPr>
+                <w:t xml:space="preserve">figures/part_b_tflops_vs_size_74396ae57bdb.png</w:t>
+              </w:r>
+            </w:hyperlink>
+          </w:p>
+        </w:tc>
+        <w:tc>
+          <w:tcPr>
+            <w:tcW w:type="dxa" w:w="5054"/>
+            <w:tcMar>
+              <w:top w:type="dxa" w:w="60"/>
+              <w:left w:type="dxa" w:w="100"/>
+              <w:bottom w:type="dxa" w:w="60"/>
+              <w:right w:type="dxa" w:w="100"/>
+            </w:tcMar>
+          </w:tcPr>
+          <w:p>
+            <w:pPr>
+              <w:spacing w:after="0" w:line="240"/>
+            </w:pPr>
+            <w:r>
+              <w:rPr>
+                <w:rFonts w:ascii="Calibri" w:cs="Calibri" w:eastAsia="Calibri" w:hAnsi="Calibri"/>
+                <w:b w:val="false"/>
+                <w:bCs w:val="false"/>
+                <w:color w:val="1A1A1A"/>
+                <w:sz w:val="19"/>
+                <w:szCs w:val="19"/>
+              </w:rPr>
+              <w:t xml:space="preserve">Figure 1</w:t>
+            </w:r>
+          </w:p>
+        </w:tc>
+      </w:tr>
+      <w:tr>
+        <w:tc>
+          <w:tcPr>
+            <w:tcW w:type="dxa" w:w="4306"/>
+            <w:tcMar>
+              <w:top w:type="dxa" w:w="60"/>
+              <w:left w:type="dxa" w:w="100"/>
+              <w:bottom w:type="dxa" w:w="60"/>
+              <w:right w:type="dxa" w:w="100"/>
+            </w:tcMar>
+          </w:tcPr>
+          <w:p>
+            <w:pPr>
+              <w:spacing w:after="0" w:line="240"/>
+            </w:pPr>
+            <w:hyperlink w:history="1" r:id="rIdhfqhyxnwvdm--oow0fkgr">
+              <w:r>
+                <w:rPr>
+                  <w:rStyle w:val="Hyperlink"/>
+                  <w:rFonts w:ascii="Calibri" w:cs="Calibri" w:eastAsia="Calibri" w:hAnsi="Calibri"/>
+                  <w:color w:val="1155CC"/>
+                  <w:sz w:val="19"/>
+                  <w:szCs w:val="19"/>
+                  <w:u w:val="single"/>
+                </w:rPr>
+                <w:t xml:space="preserve">figures/part_c_roofline_74396ae57bdb.png</w:t>
+              </w:r>
+            </w:hyperlink>
+          </w:p>
+        </w:tc>
+        <w:tc>
+          <w:tcPr>
+            <w:tcW w:type="dxa" w:w="5054"/>
+            <w:tcMar>
+              <w:top w:type="dxa" w:w="60"/>
+              <w:left w:type="dxa" w:w="100"/>
+              <w:bottom w:type="dxa" w:w="60"/>
+              <w:right w:type="dxa" w:w="100"/>
+            </w:tcMar>
+          </w:tcPr>
+          <w:p>
+            <w:pPr>
+              <w:spacing w:after="0" w:line="240"/>
+            </w:pPr>
+            <w:r>
+              <w:rPr>
+                <w:rFonts w:ascii="Calibri" w:cs="Calibri" w:eastAsia="Calibri" w:hAnsi="Calibri"/>
+                <w:b w:val="false"/>
+                <w:bCs w:val="false"/>
+                <w:color w:val="1A1A1A"/>
+                <w:sz w:val="19"/>
+                <w:szCs w:val="19"/>
+              </w:rPr>
+              <w:t xml:space="preserve">Figure 2</w:t>
+            </w:r>
+          </w:p>
+        </w:tc>
+      </w:tr>
+      <w:tr>
+        <w:tc>
+          <w:tcPr>
+            <w:tcW w:type="dxa" w:w="4306"/>
+            <w:tcMar>
+              <w:top w:type="dxa" w:w="60"/>
+              <w:left w:type="dxa" w:w="100"/>
+              <w:bottom w:type="dxa" w:w="60"/>
+              <w:right w:type="dxa" w:w="100"/>
+            </w:tcMar>
+          </w:tcPr>
+          <w:p>
+            <w:pPr>
+              <w:spacing w:after="0" w:line="240"/>
+            </w:pPr>
+            <w:hyperlink w:history="1" r:id="rIdikbiwtc9bfync0rxyvavl">
+              <w:r>
+                <w:rPr>
+                  <w:rStyle w:val="Hyperlink"/>
+                  <w:rFonts w:ascii="Calibri" w:cs="Calibri" w:eastAsia="Calibri" w:hAnsi="Calibri"/>
+                  <w:color w:val="1155CC"/>
+                  <w:sz w:val="19"/>
+                  <w:szCs w:val="19"/>
+                  <w:u w:val="single"/>
+                </w:rPr>
+                <w:t xml:space="preserve">figures/part_d_latency_74396ae57bdb.png</w:t>
+              </w:r>
+            </w:hyperlink>
+          </w:p>
+        </w:tc>
+        <w:tc>
+          <w:tcPr>
+            <w:tcW w:type="dxa" w:w="5054"/>
+            <w:tcMar>
+              <w:top w:type="dxa" w:w="60"/>
+              <w:left w:type="dxa" w:w="100"/>
+              <w:bottom w:type="dxa" w:w="60"/>
+              <w:right w:type="dxa" w:w="100"/>
+            </w:tcMar>
+          </w:tcPr>
+          <w:p>
+            <w:pPr>
+              <w:spacing w:after="0" w:line="240"/>
+            </w:pPr>
+            <w:r>
+              <w:rPr>
+                <w:rFonts w:ascii="Calibri" w:cs="Calibri" w:eastAsia="Calibri" w:hAnsi="Calibri"/>
+                <w:b w:val="false"/>
+                <w:bCs w:val="false"/>
+                <w:color w:val="1A1A1A"/>
+                <w:sz w:val="19"/>
+                <w:szCs w:val="19"/>
+              </w:rPr>
+              <w:t xml:space="preserve">Figure 4</w:t>
+            </w:r>
+          </w:p>
+        </w:tc>
+      </w:tr>
+      <w:tr>
+        <w:tc>
+          <w:tcPr>
+            <w:tcW w:type="dxa" w:w="4306"/>
+            <w:tcMar>
+              <w:top w:type="dxa" w:w="60"/>
+              <w:left w:type="dxa" w:w="100"/>
+              <w:bottom w:type="dxa" w:w="60"/>
+              <w:right w:type="dxa" w:w="100"/>
+            </w:tcMar>
+          </w:tcPr>
+          <w:p>
+            <w:pPr>
+              <w:spacing w:after="0" w:line="240"/>
+            </w:pPr>
+            <w:hyperlink w:history="1" r:id="rIdy-fdvpkq6faysost9ycz5">
+              <w:r>
+                <w:rPr>
+                  <w:rStyle w:val="Hyperlink"/>
+                  <w:rFonts w:ascii="Calibri" w:cs="Calibri" w:eastAsia="Calibri" w:hAnsi="Calibri"/>
+                  <w:color w:val="1155CC"/>
+                  <w:sz w:val="19"/>
+                  <w:szCs w:val="19"/>
+                  <w:u w:val="single"/>
+                </w:rPr>
+                <w:t xml:space="preserve">figures/part_d_peak_memory_74396ae57bdb.png</w:t>
+              </w:r>
+            </w:hyperlink>
+          </w:p>
+        </w:tc>
+        <w:tc>
+          <w:tcPr>
+            <w:tcW w:type="dxa" w:w="5054"/>
+            <w:tcMar>
+              <w:top w:type="dxa" w:w="60"/>
+              <w:left w:type="dxa" w:w="100"/>
+              <w:bottom w:type="dxa" w:w="60"/>
+              <w:right w:type="dxa" w:w="100"/>
+            </w:tcMar>
+          </w:tcPr>
+          <w:p>
+            <w:pPr>
+              <w:spacing w:after="0" w:line="240"/>
+            </w:pPr>
+            <w:r>
+              <w:rPr>
+                <w:rFonts w:ascii="Calibri" w:cs="Calibri" w:eastAsia="Calibri" w:hAnsi="Calibri"/>
+                <w:b w:val="false"/>
+                <w:bCs w:val="false"/>
+                <w:color w:val="1A1A1A"/>
+                <w:sz w:val="19"/>
+                <w:szCs w:val="19"/>
+              </w:rPr>
+              <w:t xml:space="preserve">Figure 3</w:t>
+            </w:r>
+          </w:p>
+        </w:tc>
+      </w:tr>
+      <w:tr>
+        <w:tc>
+          <w:tcPr>
+            <w:tcW w:type="dxa" w:w="4306"/>
+            <w:tcMar>
+              <w:top w:type="dxa" w:w="60"/>
+              <w:left w:type="dxa" w:w="100"/>
+              <w:bottom w:type="dxa" w:w="60"/>
+              <w:right w:type="dxa" w:w="100"/>
+            </w:tcMar>
+          </w:tcPr>
+          <w:p>
+            <w:pPr>
+              <w:spacing w:after="0" w:line="240"/>
+            </w:pPr>
+            <w:hyperlink w:history="1" r:id="rIdl4ckh77tbnuhxzvbfrycb">
+              <w:r>
+                <w:rPr>
+                  <w:rStyle w:val="Hyperlink"/>
+                  <w:rFonts w:ascii="Calibri" w:cs="Calibri" w:eastAsia="Calibri" w:hAnsi="Calibri"/>
+                  <w:color w:val="1155CC"/>
+                  <w:sz w:val="19"/>
+                  <w:szCs w:val="19"/>
+                  <w:u w:val="single"/>
+                </w:rPr>
+                <w:t xml:space="preserve">figures/part_e_clock_temp_74396ae57bdb.png</w:t>
+              </w:r>
+            </w:hyperlink>
+          </w:p>
+        </w:tc>
+        <w:tc>
+          <w:tcPr>
+            <w:tcW w:type="dxa" w:w="5054"/>
+            <w:tcMar>
+              <w:top w:type="dxa" w:w="60"/>
+              <w:left w:type="dxa" w:w="100"/>
+              <w:bottom w:type="dxa" w:w="60"/>
+              <w:right w:type="dxa" w:w="100"/>
+            </w:tcMar>
+          </w:tcPr>
+          <w:p>
+            <w:pPr>
+              <w:spacing w:after="0" w:line="240"/>
+            </w:pPr>
+            <w:r>
+              <w:rPr>
+                <w:rFonts w:ascii="Calibri" w:cs="Calibri" w:eastAsia="Calibri" w:hAnsi="Calibri"/>
+                <w:b w:val="false"/>
+                <w:bCs w:val="false"/>
+                <w:color w:val="1A1A1A"/>
+                <w:sz w:val="19"/>
+                <w:szCs w:val="19"/>
+              </w:rPr>
+              <w:t xml:space="preserve">Figure 5</w:t>
+            </w:r>
+          </w:p>
+        </w:tc>
+      </w:tr>
+      <w:tr>
+        <w:tc>
+          <w:tcPr>
+            <w:tcW w:type="dxa" w:w="4306"/>
+            <w:tcMar>
+              <w:top w:type="dxa" w:w="60"/>
+              <w:left w:type="dxa" w:w="100"/>
+              <w:bottom w:type="dxa" w:w="60"/>
+              <w:right w:type="dxa" w:w="100"/>
+            </w:tcMar>
+          </w:tcPr>
+          <w:p>
+            <w:pPr>
+              <w:spacing w:after="0" w:line="240"/>
+            </w:pPr>
+            <w:hyperlink w:history="1" r:id="rId8oudnyol4kxhstf24f55f">
+              <w:r>
+                <w:rPr>
+                  <w:rStyle w:val="Hyperlink"/>
+                  <w:rFonts w:ascii="Calibri" w:cs="Calibri" w:eastAsia="Calibri" w:hAnsi="Calibri"/>
+                  <w:color w:val="1155CC"/>
+                  <w:sz w:val="19"/>
+                  <w:szCs w:val="19"/>
+                  <w:u w:val="single"/>
+                </w:rPr>
+                <w:t xml:space="preserve">logs/part_e_thermal_74396ae57bdb.csv</w:t>
+              </w:r>
+            </w:hyperlink>
+          </w:p>
+        </w:tc>
+        <w:tc>
+          <w:tcPr>
+            <w:tcW w:type="dxa" w:w="5054"/>
+            <w:tcMar>
+              <w:top w:type="dxa" w:w="60"/>
+              <w:left w:type="dxa" w:w="100"/>
+              <w:bottom w:type="dxa" w:w="60"/>
+              <w:right w:type="dxa" w:w="100"/>
+            </w:tcMar>
+          </w:tcPr>
+          <w:p>
+            <w:pPr>
+              <w:spacing w:after="0" w:line="240"/>
+            </w:pPr>
+            <w:r>
+              <w:rPr>
+                <w:rFonts w:ascii="Calibri" w:cs="Calibri" w:eastAsia="Calibri" w:hAnsi="Calibri"/>
+                <w:b w:val="false"/>
+                <w:bCs w:val="false"/>
+                <w:color w:val="1A1A1A"/>
+                <w:sz w:val="19"/>
+                <w:szCs w:val="19"/>
+              </w:rPr>
+              <w:t xml:space="preserve">Part E thermal log, 238 samples at 5 s</w:t>
+            </w:r>
+          </w:p>
+        </w:tc>
+      </w:tr>
+      <w:tr>
+        <w:tc>
+          <w:tcPr>
+            <w:tcW w:type="dxa" w:w="4306"/>
+            <w:tcMar>
+              <w:top w:type="dxa" w:w="60"/>
+              <w:left w:type="dxa" w:w="100"/>
+              <w:bottom w:type="dxa" w:w="60"/>
+              <w:right w:type="dxa" w:w="100"/>
+            </w:tcMar>
+          </w:tcPr>
+          <w:p>
+            <w:pPr>
+              <w:spacing w:after="0" w:line="240"/>
+            </w:pPr>
+            <w:hyperlink w:history="1" r:id="rIdz_ygr1x8abs2i1w9heicv">
+              <w:r>
+                <w:rPr>
+                  <w:rStyle w:val="Hyperlink"/>
+                  <w:rFonts w:ascii="Calibri" w:cs="Calibri" w:eastAsia="Calibri" w:hAnsi="Calibri"/>
+                  <w:color w:val="1155CC"/>
+                  <w:sz w:val="19"/>
+                  <w:szCs w:val="19"/>
+                  <w:u w:val="single"/>
+                </w:rPr>
+                <w:t xml:space="preserve">provenance/nvidia-smi-q_GeForce_RTX_5090_74396ae57bdb.txt</w:t>
+              </w:r>
+            </w:hyperlink>
+          </w:p>
+        </w:tc>
+        <w:tc>
+          <w:tcPr>
+            <w:tcW w:type="dxa" w:w="5054"/>
+            <w:tcMar>
+              <w:top w:type="dxa" w:w="60"/>
+              <w:left w:type="dxa" w:w="100"/>
+              <w:bottom w:type="dxa" w:w="60"/>
+              <w:right w:type="dxa" w:w="100"/>
+            </w:tcMar>
+          </w:tcPr>
+          <w:p>
+            <w:pPr>
+              <w:spacing w:after="0" w:line="240"/>
+            </w:pPr>
+            <w:r>
+              <w:rPr>
+                <w:rFonts w:ascii="Calibri" w:cs="Calibri" w:eastAsia="Calibri" w:hAnsi="Calibri"/>
+                <w:b w:val="false"/>
+                <w:bCs w:val="false"/>
+                <w:color w:val="1A1A1A"/>
+                <w:sz w:val="19"/>
+                <w:szCs w:val="19"/>
+              </w:rPr>
+              <w:t xml:space="preserve">complete nvidia-smi -q capture</w:t>
+            </w:r>
+          </w:p>
+        </w:tc>
+      </w:tr>
+      <w:tr>
+        <w:tc>
+          <w:tcPr>
+            <w:tcW w:type="dxa" w:w="4306"/>
+            <w:tcMar>
+              <w:top w:type="dxa" w:w="60"/>
+              <w:left w:type="dxa" w:w="100"/>
+              <w:bottom w:type="dxa" w:w="60"/>
+              <w:right w:type="dxa" w:w="100"/>
+            </w:tcMar>
+          </w:tcPr>
+          <w:p>
+            <w:pPr>
+              <w:spacing w:after="0" w:line="240"/>
+            </w:pPr>
+            <w:hyperlink w:history="1" r:id="rId-gtkz6ctymg6afchoyoip">
+              <w:r>
+                <w:rPr>
+                  <w:rStyle w:val="Hyperlink"/>
+                  <w:rFonts w:ascii="Calibri" w:cs="Calibri" w:eastAsia="Calibri" w:hAnsi="Calibri"/>
+                  <w:color w:val="1155CC"/>
+                  <w:sz w:val="19"/>
+                  <w:szCs w:val="19"/>
+                  <w:u w:val="single"/>
+                </w:rPr>
+                <w:t xml:space="preserve">reservations.md</w:t>
+              </w:r>
+            </w:hyperlink>
+          </w:p>
+        </w:tc>
+        <w:tc>
+          <w:tcPr>
+            <w:tcW w:type="dxa" w:w="5054"/>
+            <w:tcMar>
+              <w:top w:type="dxa" w:w="60"/>
+              <w:left w:type="dxa" w:w="100"/>
+              <w:bottom w:type="dxa" w:w="60"/>
+              <w:right w:type="dxa" w:w="100"/>
+            </w:tcMar>
+          </w:tcPr>
+          <w:p>
+            <w:pPr>
+              <w:spacing w:after="0" w:line="240"/>
+            </w:pPr>
+            <w:r>
+              <w:rPr>
+                <w:rFonts w:ascii="Calibri" w:cs="Calibri" w:eastAsia="Calibri" w:hAnsi="Calibri"/>
+                <w:b w:val="false"/>
+                <w:bCs w:val="false"/>
+                <w:color w:val="1A1A1A"/>
+                <w:sz w:val="19"/>
+                <w:szCs w:val="19"/>
+              </w:rPr>
+              <w:t xml:space="preserve">reservation record, hours reserved against consumed</w:t>
+            </w:r>
+          </w:p>
+        </w:tc>
+      </w:tr>
+      <w:tr>
+        <w:tc>
+          <w:tcPr>
+            <w:tcW w:type="dxa" w:w="4306"/>
+            <w:tcMar>
+              <w:top w:type="dxa" w:w="60"/>
+              <w:left w:type="dxa" w:w="100"/>
+              <w:bottom w:type="dxa" w:w="60"/>
+              <w:right w:type="dxa" w:w="100"/>
+            </w:tcMar>
+          </w:tcPr>
+          <w:p>
+            <w:pPr>
+              <w:spacing w:after="0" w:line="240"/>
+            </w:pPr>
+            <w:hyperlink w:history="1" r:id="rIdb4glwmsukma9vte8pqgr0">
+              <w:r>
+                <w:rPr>
+                  <w:rStyle w:val="Hyperlink"/>
+                  <w:rFonts w:ascii="Calibri" w:cs="Calibri" w:eastAsia="Calibri" w:hAnsi="Calibri"/>
+                  <w:color w:val="1155CC"/>
+                  <w:sz w:val="19"/>
+                  <w:szCs w:val="19"/>
+                  <w:u w:val="single"/>
+                </w:rPr>
+                <w:t xml:space="preserve">run_all.sh</w:t>
+              </w:r>
+            </w:hyperlink>
+          </w:p>
+        </w:tc>
+        <w:tc>
+          <w:tcPr>
+            <w:tcW w:type="dxa" w:w="5054"/>
+            <w:tcMar>
+              <w:top w:type="dxa" w:w="60"/>
+              <w:left w:type="dxa" w:w="100"/>
+              <w:bottom w:type="dxa" w:w="60"/>
+              <w:right w:type="dxa" w:w="100"/>
+            </w:tcMar>
+          </w:tcPr>
+          <w:p>
+            <w:pPr>
+              <w:spacing w:after="0" w:line="240"/>
+            </w:pPr>
+            <w:r>
+              <w:rPr>
+                <w:rFonts w:ascii="Calibri" w:cs="Calibri" w:eastAsia="Calibri" w:hAnsi="Calibri"/>
+                <w:b w:val="false"/>
+                <w:bCs w:val="false"/>
+                <w:color w:val="1A1A1A"/>
+                <w:sz w:val="19"/>
+                <w:szCs w:val="19"/>
+              </w:rPr>
+              <w:t xml:space="preserve">runs Parts A to E then rebuilds figures and tables</w:t>
+            </w:r>
+          </w:p>
+        </w:tc>
+      </w:tr>
+      <w:tr>
+        <w:tc>
+          <w:tcPr>
+            <w:tcW w:type="dxa" w:w="4306"/>
+            <w:tcMar>
+              <w:top w:type="dxa" w:w="60"/>
+              <w:left w:type="dxa" w:w="100"/>
+              <w:bottom w:type="dxa" w:w="60"/>
+              <w:right w:type="dxa" w:w="100"/>
+            </w:tcMar>
+          </w:tcPr>
+          <w:p>
+            <w:pPr>
+              <w:spacing w:after="0" w:line="240"/>
+            </w:pPr>
+            <w:hyperlink w:history="1" r:id="rIdg4oc-2kefut_mrd2v9brt">
+              <w:r>
+                <w:rPr>
+                  <w:rStyle w:val="Hyperlink"/>
+                  <w:rFonts w:ascii="Calibri" w:cs="Calibri" w:eastAsia="Calibri" w:hAnsi="Calibri"/>
+                  <w:color w:val="1155CC"/>
+                  <w:sz w:val="19"/>
+                  <w:szCs w:val="19"/>
+                  <w:u w:val="single"/>
+                </w:rPr>
+                <w:t xml:space="preserve">scripts/common.py</w:t>
+              </w:r>
+            </w:hyperlink>
+          </w:p>
+        </w:tc>
+        <w:tc>
+          <w:tcPr>
+            <w:tcW w:type="dxa" w:w="5054"/>
+            <w:tcMar>
+              <w:top w:type="dxa" w:w="60"/>
+              <w:left w:type="dxa" w:w="100"/>
+              <w:bottom w:type="dxa" w:w="60"/>
+              <w:right w:type="dxa" w:w="100"/>
+            </w:tcMar>
+          </w:tcPr>
+          <w:p>
+            <w:pPr>
+              <w:spacing w:after="0" w:line="240"/>
+            </w:pPr>
+            <w:r>
+              <w:rPr>
+                <w:rFonts w:ascii="Calibri" w:cs="Calibri" w:eastAsia="Calibri" w:hAnsi="Calibri"/>
+                <w:b w:val="false"/>
+                <w:bCs w:val="false"/>
+                <w:color w:val="1A1A1A"/>
+                <w:sz w:val="19"/>
+                <w:szCs w:val="19"/>
+              </w:rPr>
+              <w:t xml:space="preserve">shared helpers: timing, GPU identity, run log</w:t>
+            </w:r>
+          </w:p>
+        </w:tc>
+      </w:tr>
+      <w:tr>
+        <w:tc>
+          <w:tcPr>
+            <w:tcW w:type="dxa" w:w="4306"/>
+            <w:tcMar>
+              <w:top w:type="dxa" w:w="60"/>
+              <w:left w:type="dxa" w:w="100"/>
+              <w:bottom w:type="dxa" w:w="60"/>
+              <w:right w:type="dxa" w:w="100"/>
+            </w:tcMar>
+          </w:tcPr>
+          <w:p>
+            <w:pPr>
+              <w:spacing w:after="0" w:line="240"/>
+            </w:pPr>
+            <w:hyperlink w:history="1" r:id="rIdrrldbanix2sz960txoupv">
+              <w:r>
+                <w:rPr>
+                  <w:rStyle w:val="Hyperlink"/>
+                  <w:rFonts w:ascii="Calibri" w:cs="Calibri" w:eastAsia="Calibri" w:hAnsi="Calibri"/>
+                  <w:color w:val="1155CC"/>
+                  <w:sz w:val="19"/>
+                  <w:szCs w:val="19"/>
+                  <w:u w:val="single"/>
+                </w:rPr>
+                <w:t xml:space="preserve">scripts/fakecuda.py</w:t>
+              </w:r>
+            </w:hyperlink>
+          </w:p>
+        </w:tc>
+        <w:tc>
+          <w:tcPr>
+            <w:tcW w:type="dxa" w:w="5054"/>
+            <w:tcMar>
+              <w:top w:type="dxa" w:w="60"/>
+              <w:left w:type="dxa" w:w="100"/>
+              <w:bottom w:type="dxa" w:w="60"/>
+              <w:right w:type="dxa" w:w="100"/>
+            </w:tcMar>
+          </w:tcPr>
+          <w:p>
+            <w:pPr>
+              <w:spacing w:after="0" w:line="240"/>
+            </w:pPr>
+            <w:r>
+              <w:rPr>
+                <w:rFonts w:ascii="Calibri" w:cs="Calibri" w:eastAsia="Calibri" w:hAnsi="Calibri"/>
+                <w:b w:val="false"/>
+                <w:bCs w:val="false"/>
+                <w:color w:val="1A1A1A"/>
+                <w:sz w:val="19"/>
+                <w:szCs w:val="19"/>
+              </w:rPr>
+              <w:t xml:space="preserve">simulated CUDA device used for offline testing</w:t>
+            </w:r>
+          </w:p>
+        </w:tc>
+      </w:tr>
+      <w:tr>
+        <w:tc>
+          <w:tcPr>
+            <w:tcW w:type="dxa" w:w="4306"/>
+            <w:tcMar>
+              <w:top w:type="dxa" w:w="60"/>
+              <w:left w:type="dxa" w:w="100"/>
+              <w:bottom w:type="dxa" w:w="60"/>
+              <w:right w:type="dxa" w:w="100"/>
+            </w:tcMar>
+          </w:tcPr>
+          <w:p>
+            <w:pPr>
+              <w:spacing w:after="0" w:line="240"/>
+            </w:pPr>
+            <w:hyperlink w:history="1" r:id="rIde5ghdm23vyu_tpwezxumz">
+              <w:r>
+                <w:rPr>
+                  <w:rStyle w:val="Hyperlink"/>
+                  <w:rFonts w:ascii="Calibri" w:cs="Calibri" w:eastAsia="Calibri" w:hAnsi="Calibri"/>
+                  <w:color w:val="1155CC"/>
+                  <w:sz w:val="19"/>
+                  <w:szCs w:val="19"/>
+                  <w:u w:val="single"/>
+                </w:rPr>
+                <w:t xml:space="preserve">scripts/gpu_specs.json</w:t>
+              </w:r>
+            </w:hyperlink>
+          </w:p>
+        </w:tc>
+        <w:tc>
+          <w:tcPr>
+            <w:tcW w:type="dxa" w:w="5054"/>
+            <w:tcMar>
+              <w:top w:type="dxa" w:w="60"/>
+              <w:left w:type="dxa" w:w="100"/>
+              <w:bottom w:type="dxa" w:w="60"/>
+              <w:right w:type="dxa" w:w="100"/>
+            </w:tcMar>
+          </w:tcPr>
+          <w:p>
+            <w:pPr>
+              <w:spacing w:after="0" w:line="240"/>
+            </w:pPr>
+            <w:r>
+              <w:rPr>
+                <w:rFonts w:ascii="Calibri" w:cs="Calibri" w:eastAsia="Calibri" w:hAnsi="Calibri"/>
+                <w:b w:val="false"/>
+                <w:bCs w:val="false"/>
+                <w:color w:val="1A1A1A"/>
+                <w:sz w:val="19"/>
+                <w:szCs w:val="19"/>
+              </w:rPr>
+              <w:t xml:space="preserve">vendor peaks transcribed from the whitepapers</w:t>
+            </w:r>
+          </w:p>
+        </w:tc>
+      </w:tr>
+      <w:tr>
+        <w:tc>
+          <w:tcPr>
+            <w:tcW w:type="dxa" w:w="4306"/>
+            <w:tcMar>
+              <w:top w:type="dxa" w:w="60"/>
+              <w:left w:type="dxa" w:w="100"/>
+              <w:bottom w:type="dxa" w:w="60"/>
+              <w:right w:type="dxa" w:w="100"/>
+            </w:tcMar>
+          </w:tcPr>
+          <w:p>
+            <w:pPr>
+              <w:spacing w:after="0" w:line="240"/>
+            </w:pPr>
+            <w:hyperlink w:history="1" r:id="rIdntolerfp4mbgs3uh8cyan">
+              <w:r>
+                <w:rPr>
+                  <w:rStyle w:val="Hyperlink"/>
+                  <w:rFonts w:ascii="Calibri" w:cs="Calibri" w:eastAsia="Calibri" w:hAnsi="Calibri"/>
+                  <w:color w:val="1155CC"/>
+                  <w:sz w:val="19"/>
+                  <w:szCs w:val="19"/>
+                  <w:u w:val="single"/>
+                </w:rPr>
+                <w:t xml:space="preserve">scripts/make_figures.py</w:t>
+              </w:r>
+            </w:hyperlink>
+          </w:p>
+        </w:tc>
+        <w:tc>
+          <w:tcPr>
+            <w:tcW w:type="dxa" w:w="5054"/>
+            <w:tcMar>
+              <w:top w:type="dxa" w:w="60"/>
+              <w:left w:type="dxa" w:w="100"/>
+              <w:bottom w:type="dxa" w:w="60"/>
+              <w:right w:type="dxa" w:w="100"/>
+            </w:tcMar>
+          </w:tcPr>
+          <w:p>
+            <w:pPr>
+              <w:spacing w:after="0" w:line="240"/>
+            </w:pPr>
+            <w:r>
+              <w:rPr>
+                <w:rFonts w:ascii="Calibri" w:cs="Calibri" w:eastAsia="Calibri" w:hAnsi="Calibri"/>
+                <w:b w:val="false"/>
+                <w:bCs w:val="false"/>
+                <w:color w:val="1A1A1A"/>
+                <w:sz w:val="19"/>
+                <w:szCs w:val="19"/>
+              </w:rPr>
+              <w:t xml:space="preserve">builds every figure from data and logs</w:t>
+            </w:r>
+          </w:p>
+        </w:tc>
+      </w:tr>
+      <w:tr>
+        <w:tc>
+          <w:tcPr>
+            <w:tcW w:type="dxa" w:w="4306"/>
+            <w:tcMar>
+              <w:top w:type="dxa" w:w="60"/>
+              <w:left w:type="dxa" w:w="100"/>
+              <w:bottom w:type="dxa" w:w="60"/>
+              <w:right w:type="dxa" w:w="100"/>
+            </w:tcMar>
+          </w:tcPr>
+          <w:p>
+            <w:pPr>
+              <w:spacing w:after="0" w:line="240"/>
+            </w:pPr>
+            <w:hyperlink w:history="1" r:id="rIdxzkwqhlmiydgqumc-x8n6">
+              <w:r>
+                <w:rPr>
+                  <w:rStyle w:val="Hyperlink"/>
+                  <w:rFonts w:ascii="Calibri" w:cs="Calibri" w:eastAsia="Calibri" w:hAnsi="Calibri"/>
+                  <w:color w:val="1155CC"/>
+                  <w:sz w:val="19"/>
+                  <w:szCs w:val="19"/>
+                  <w:u w:val="single"/>
+                </w:rPr>
+                <w:t xml:space="preserve">scripts/make_metrics.py</w:t>
+              </w:r>
+            </w:hyperlink>
+          </w:p>
+        </w:tc>
+        <w:tc>
+          <w:tcPr>
+            <w:tcW w:type="dxa" w:w="5054"/>
+            <w:tcMar>
+              <w:top w:type="dxa" w:w="60"/>
+              <w:left w:type="dxa" w:w="100"/>
+              <w:bottom w:type="dxa" w:w="60"/>
+              <w:right w:type="dxa" w:w="100"/>
+            </w:tcMar>
+          </w:tcPr>
+          <w:p>
+            <w:pPr>
+              <w:spacing w:after="0" w:line="240"/>
+            </w:pPr>
+            <w:r>
+              <w:rPr>
+                <w:rFonts w:ascii="Calibri" w:cs="Calibri" w:eastAsia="Calibri" w:hAnsi="Calibri"/>
+                <w:b w:val="false"/>
+                <w:bCs w:val="false"/>
+                <w:color w:val="1A1A1A"/>
+                <w:sz w:val="19"/>
+                <w:szCs w:val="19"/>
+              </w:rPr>
+              <w:t xml:space="preserve">builds METRICS.md including Table HW2.5.1</w:t>
+            </w:r>
+          </w:p>
+        </w:tc>
+      </w:tr>
+      <w:tr>
+        <w:tc>
+          <w:tcPr>
+            <w:tcW w:type="dxa" w:w="4306"/>
+            <w:tcMar>
+              <w:top w:type="dxa" w:w="60"/>
+              <w:left w:type="dxa" w:w="100"/>
+              <w:bottom w:type="dxa" w:w="60"/>
+              <w:right w:type="dxa" w:w="100"/>
+            </w:tcMar>
+          </w:tcPr>
+          <w:p>
+            <w:pPr>
+              <w:spacing w:after="0" w:line="240"/>
+            </w:pPr>
+            <w:hyperlink w:history="1" r:id="rIdoiyln30iqzgi0dkvehb2z">
+              <w:r>
+                <w:rPr>
+                  <w:rStyle w:val="Hyperlink"/>
+                  <w:rFonts w:ascii="Calibri" w:cs="Calibri" w:eastAsia="Calibri" w:hAnsi="Calibri"/>
+                  <w:color w:val="1155CC"/>
+                  <w:sz w:val="19"/>
+                  <w:szCs w:val="19"/>
+                  <w:u w:val="single"/>
+                </w:rPr>
+                <w:t xml:space="preserve">scripts/part_a_provenance.py</w:t>
+              </w:r>
+            </w:hyperlink>
+          </w:p>
+        </w:tc>
+        <w:tc>
+          <w:tcPr>
+            <w:tcW w:type="dxa" w:w="5054"/>
+            <w:tcMar>
+              <w:top w:type="dxa" w:w="60"/>
+              <w:left w:type="dxa" w:w="100"/>
+              <w:bottom w:type="dxa" w:w="60"/>
+              <w:right w:type="dxa" w:w="100"/>
+            </w:tcMar>
+          </w:tcPr>
+          <w:p>
+            <w:pPr>
+              <w:spacing w:after="0" w:line="240"/>
+            </w:pPr>
+            <w:r>
+              <w:rPr>
+                <w:rFonts w:ascii="Calibri" w:cs="Calibri" w:eastAsia="Calibri" w:hAnsi="Calibri"/>
+                <w:b w:val="false"/>
+                <w:bCs w:val="false"/>
+                <w:color w:val="1A1A1A"/>
+                <w:sz w:val="19"/>
+                <w:szCs w:val="19"/>
+              </w:rPr>
+              <w:t xml:space="preserve">Part A</w:t>
+            </w:r>
+          </w:p>
+        </w:tc>
+      </w:tr>
+      <w:tr>
+        <w:tc>
+          <w:tcPr>
+            <w:tcW w:type="dxa" w:w="4306"/>
+            <w:tcMar>
+              <w:top w:type="dxa" w:w="60"/>
+              <w:left w:type="dxa" w:w="100"/>
+              <w:bottom w:type="dxa" w:w="60"/>
+              <w:right w:type="dxa" w:w="100"/>
+            </w:tcMar>
+          </w:tcPr>
+          <w:p>
+            <w:pPr>
+              <w:spacing w:after="0" w:line="240"/>
+            </w:pPr>
+            <w:hyperlink w:history="1" r:id="rIdor5f4-yvkh6or_2bhrpnc">
+              <w:r>
+                <w:rPr>
+                  <w:rStyle w:val="Hyperlink"/>
+                  <w:rFonts w:ascii="Calibri" w:cs="Calibri" w:eastAsia="Calibri" w:hAnsi="Calibri"/>
+                  <w:color w:val="1155CC"/>
+                  <w:sz w:val="19"/>
+                  <w:szCs w:val="19"/>
+                  <w:u w:val="single"/>
+                </w:rPr>
+                <w:t xml:space="preserve">scripts/part_b_precision.py</w:t>
+              </w:r>
+            </w:hyperlink>
+          </w:p>
+        </w:tc>
+        <w:tc>
+          <w:tcPr>
+            <w:tcW w:type="dxa" w:w="5054"/>
+            <w:tcMar>
+              <w:top w:type="dxa" w:w="60"/>
+              <w:left w:type="dxa" w:w="100"/>
+              <w:bottom w:type="dxa" w:w="60"/>
+              <w:right w:type="dxa" w:w="100"/>
+            </w:tcMar>
+          </w:tcPr>
+          <w:p>
+            <w:pPr>
+              <w:spacing w:after="0" w:line="240"/>
+            </w:pPr>
+            <w:r>
+              <w:rPr>
+                <w:rFonts w:ascii="Calibri" w:cs="Calibri" w:eastAsia="Calibri" w:hAnsi="Calibri"/>
+                <w:b w:val="false"/>
+                <w:bCs w:val="false"/>
+                <w:color w:val="1A1A1A"/>
+                <w:sz w:val="19"/>
+                <w:szCs w:val="19"/>
+              </w:rPr>
+              <w:t xml:space="preserve">Part B</w:t>
+            </w:r>
+          </w:p>
+        </w:tc>
+      </w:tr>
+      <w:tr>
+        <w:tc>
+          <w:tcPr>
+            <w:tcW w:type="dxa" w:w="4306"/>
+            <w:tcMar>
+              <w:top w:type="dxa" w:w="60"/>
+              <w:left w:type="dxa" w:w="100"/>
+              <w:bottom w:type="dxa" w:w="60"/>
+              <w:right w:type="dxa" w:w="100"/>
+            </w:tcMar>
+          </w:tcPr>
+          <w:p>
+            <w:pPr>
+              <w:spacing w:after="0" w:line="240"/>
+            </w:pPr>
+            <w:hyperlink w:history="1" r:id="rIdi5kjak-ipqk2acipch5d1">
+              <w:r>
+                <w:rPr>
+                  <w:rStyle w:val="Hyperlink"/>
+                  <w:rFonts w:ascii="Calibri" w:cs="Calibri" w:eastAsia="Calibri" w:hAnsi="Calibri"/>
+                  <w:color w:val="1155CC"/>
+                  <w:sz w:val="19"/>
+                  <w:szCs w:val="19"/>
+                  <w:u w:val="single"/>
+                </w:rPr>
+                <w:t xml:space="preserve">scripts/part_c_roofline.py</w:t>
+              </w:r>
+            </w:hyperlink>
+          </w:p>
+        </w:tc>
+        <w:tc>
+          <w:tcPr>
+            <w:tcW w:type="dxa" w:w="5054"/>
+            <w:tcMar>
+              <w:top w:type="dxa" w:w="60"/>
+              <w:left w:type="dxa" w:w="100"/>
+              <w:bottom w:type="dxa" w:w="60"/>
+              <w:right w:type="dxa" w:w="100"/>
+            </w:tcMar>
+          </w:tcPr>
+          <w:p>
+            <w:pPr>
+              <w:spacing w:after="0" w:line="240"/>
+            </w:pPr>
+            <w:r>
+              <w:rPr>
+                <w:rFonts w:ascii="Calibri" w:cs="Calibri" w:eastAsia="Calibri" w:hAnsi="Calibri"/>
+                <w:b w:val="false"/>
+                <w:bCs w:val="false"/>
+                <w:color w:val="1A1A1A"/>
+                <w:sz w:val="19"/>
+                <w:szCs w:val="19"/>
+              </w:rPr>
+              <w:t xml:space="preserve">Part C</w:t>
+            </w:r>
+          </w:p>
+        </w:tc>
+      </w:tr>
+      <w:tr>
+        <w:tc>
+          <w:tcPr>
+            <w:tcW w:type="dxa" w:w="4306"/>
+            <w:tcMar>
+              <w:top w:type="dxa" w:w="60"/>
+              <w:left w:type="dxa" w:w="100"/>
+              <w:bottom w:type="dxa" w:w="60"/>
+              <w:right w:type="dxa" w:w="100"/>
+            </w:tcMar>
+          </w:tcPr>
+          <w:p>
+            <w:pPr>
+              <w:spacing w:after="0" w:line="240"/>
+            </w:pPr>
+            <w:hyperlink w:history="1" r:id="rIdd0jnyjzywweuyl3pna-wv">
+              <w:r>
+                <w:rPr>
+                  <w:rStyle w:val="Hyperlink"/>
+                  <w:rFonts w:ascii="Calibri" w:cs="Calibri" w:eastAsia="Calibri" w:hAnsi="Calibri"/>
+                  <w:color w:val="1155CC"/>
+                  <w:sz w:val="19"/>
+                  <w:szCs w:val="19"/>
+                  <w:u w:val="single"/>
+                </w:rPr>
+                <w:t xml:space="preserve">scripts/part_d_attention.py</w:t>
+              </w:r>
+            </w:hyperlink>
+          </w:p>
+        </w:tc>
+        <w:tc>
+          <w:tcPr>
+            <w:tcW w:type="dxa" w:w="5054"/>
+            <w:tcMar>
+              <w:top w:type="dxa" w:w="60"/>
+              <w:left w:type="dxa" w:w="100"/>
+              <w:bottom w:type="dxa" w:w="60"/>
+              <w:right w:type="dxa" w:w="100"/>
+            </w:tcMar>
+          </w:tcPr>
+          <w:p>
+            <w:pPr>
+              <w:spacing w:after="0" w:line="240"/>
+            </w:pPr>
+            <w:r>
+              <w:rPr>
+                <w:rFonts w:ascii="Calibri" w:cs="Calibri" w:eastAsia="Calibri" w:hAnsi="Calibri"/>
+                <w:b w:val="false"/>
+                <w:bCs w:val="false"/>
+                <w:color w:val="1A1A1A"/>
+                <w:sz w:val="19"/>
+                <w:szCs w:val="19"/>
+              </w:rPr>
+              <w:t xml:space="preserve">Part D</w:t>
+            </w:r>
+          </w:p>
+        </w:tc>
+      </w:tr>
+      <w:tr>
+        <w:tc>
+          <w:tcPr>
+            <w:tcW w:type="dxa" w:w="4306"/>
+            <w:tcMar>
+              <w:top w:type="dxa" w:w="60"/>
+              <w:left w:type="dxa" w:w="100"/>
+              <w:bottom w:type="dxa" w:w="60"/>
+              <w:right w:type="dxa" w:w="100"/>
+            </w:tcMar>
+          </w:tcPr>
+          <w:p>
+            <w:pPr>
+              <w:spacing w:after="0" w:line="240"/>
+            </w:pPr>
+            <w:hyperlink w:history="1" r:id="rIdbzpj5xg7ibzct4q2udzty">
+              <w:r>
+                <w:rPr>
+                  <w:rStyle w:val="Hyperlink"/>
+                  <w:rFonts w:ascii="Calibri" w:cs="Calibri" w:eastAsia="Calibri" w:hAnsi="Calibri"/>
+                  <w:color w:val="1155CC"/>
+                  <w:sz w:val="19"/>
+                  <w:szCs w:val="19"/>
+                  <w:u w:val="single"/>
+                </w:rPr>
+                <w:t xml:space="preserve">scripts/part_e_thermal.py</w:t>
+              </w:r>
+            </w:hyperlink>
+          </w:p>
+        </w:tc>
+        <w:tc>
+          <w:tcPr>
+            <w:tcW w:type="dxa" w:w="5054"/>
+            <w:tcMar>
+              <w:top w:type="dxa" w:w="60"/>
+              <w:left w:type="dxa" w:w="100"/>
+              <w:bottom w:type="dxa" w:w="60"/>
+              <w:right w:type="dxa" w:w="100"/>
+            </w:tcMar>
+          </w:tcPr>
+          <w:p>
+            <w:pPr>
+              <w:spacing w:after="0" w:line="240"/>
+            </w:pPr>
+            <w:r>
+              <w:rPr>
+                <w:rFonts w:ascii="Calibri" w:cs="Calibri" w:eastAsia="Calibri" w:hAnsi="Calibri"/>
+                <w:b w:val="false"/>
+                <w:bCs w:val="false"/>
+                <w:color w:val="1A1A1A"/>
+                <w:sz w:val="19"/>
+                <w:szCs w:val="19"/>
+              </w:rPr>
+              <w:t xml:space="preserve">Part E</w:t>
+            </w:r>
+          </w:p>
+        </w:tc>
+      </w:tr>
+      <w:tr>
+        <w:tc>
+          <w:tcPr>
+            <w:tcW w:type="dxa" w:w="4306"/>
+            <w:tcMar>
+              <w:top w:type="dxa" w:w="60"/>
+              <w:left w:type="dxa" w:w="100"/>
+              <w:bottom w:type="dxa" w:w="60"/>
+              <w:right w:type="dxa" w:w="100"/>
+            </w:tcMar>
+          </w:tcPr>
+          <w:p>
+            <w:pPr>
+              <w:spacing w:after="0" w:line="240"/>
+            </w:pPr>
+            <w:hyperlink w:history="1" r:id="rIdjihrrp4layqexpoh-la52">
+              <w:r>
+                <w:rPr>
+                  <w:rStyle w:val="Hyperlink"/>
+                  <w:rFonts w:ascii="Calibri" w:cs="Calibri" w:eastAsia="Calibri" w:hAnsi="Calibri"/>
+                  <w:color w:val="1155CC"/>
+                  <w:sz w:val="19"/>
+                  <w:szCs w:val="19"/>
+                  <w:u w:val="single"/>
+                </w:rPr>
+                <w:t xml:space="preserve">scripts/rehearse.py</w:t>
+              </w:r>
+            </w:hyperlink>
+          </w:p>
+        </w:tc>
+        <w:tc>
+          <w:tcPr>
+            <w:tcW w:type="dxa" w:w="5054"/>
+            <w:tcMar>
+              <w:top w:type="dxa" w:w="60"/>
+              <w:left w:type="dxa" w:w="100"/>
+              <w:bottom w:type="dxa" w:w="60"/>
+              <w:right w:type="dxa" w:w="100"/>
+            </w:tcMar>
+          </w:tcPr>
+          <w:p>
+            <w:pPr>
+              <w:spacing w:after="0" w:line="240"/>
+            </w:pPr>
+            <w:r>
+              <w:rPr>
+                <w:rFonts w:ascii="Calibri" w:cs="Calibri" w:eastAsia="Calibri" w:hAnsi="Calibri"/>
+                <w:b w:val="false"/>
+                <w:bCs w:val="false"/>
+                <w:color w:val="1A1A1A"/>
+                <w:sz w:val="19"/>
+                <w:szCs w:val="19"/>
+              </w:rPr>
+              <w:t xml:space="preserve">offline harness, runs all parts against the simulated device</w:t>
+            </w:r>
+          </w:p>
+        </w:tc>
+      </w:tr>
+    </w:tbl>
+    <w:p>
+      <w:pPr>
+        <w:pStyle w:val="Heading1"/>
+        <w:spacing w:after="160" w:before="320"/>
+      </w:pPr>
+      <w:r>
+        <w:t xml:space="preserve">10. Repository and AI use</w:t>
+      </w:r>
+    </w:p>
+    <w:p>
+      <w:pPr>
+        <w:spacing w:after="120" w:line="276"/>
+      </w:pPr>
+      <w:r>
+        <w:rPr>
+          <w:rFonts w:ascii="Calibri" w:cs="Calibri" w:eastAsia="Calibri" w:hAnsi="Calibri"/>
+          <w:color w:val="1A1A1A"/>
+          <w:sz w:val="21"/>
+          <w:szCs w:val="21"/>
+        </w:rPr>
+        <w:t xml:space="preserve">All code, data, logs, figures and generated tables are committed and tagged hw2-5 at </w:t>
+      </w:r>
+      <w:hyperlink w:history="1" r:id="rIdp9wstnmobx1bfn7wggnlo">
+        <w:r>
+          <w:rPr>
+            <w:rStyle w:val="Hyperlink"/>
+            <w:rFonts w:ascii="Calibri" w:cs="Calibri" w:eastAsia="Calibri" w:hAnsi="Calibri"/>
+            <w:color w:val="1155CC"/>
+            <w:sz w:val="21"/>
+            <w:szCs w:val="21"/>
+            <w:u w:val="single"/>
+          </w:rPr>
+          <w:t xml:space="preserve">github.com/aneessaheba/DATA266</w:t>
+        </w:r>
+      </w:hyperlink>
+      <w:r>
+        <w:rPr>
+          <w:rFonts w:ascii="Calibri" w:cs="Calibri" w:eastAsia="Calibri" w:hAnsi="Calibri"/>
+          <w:color w:val="1A1A1A"/>
+          <w:sz w:val="21"/>
+          <w:szCs w:val="21"/>
+        </w:rPr>
+        <w:t xml:space="preserve">. AI use is disclosed separately in </w:t>
+      </w:r>
+    </w:p>
+    <w:p>
+      <w:pPr>
+        <w:spacing w:after="120" w:line="276"/>
+      </w:pPr>
+      <w:hyperlink w:history="1" r:id="rIdgy9__ctqt1lpkdmueaa6t">
+        <w:r>
+          <w:rPr>
+            <w:rStyle w:val="Hyperlink"/>
+            <w:rFonts w:ascii="Calibri" w:cs="Calibri" w:eastAsia="Calibri" w:hAnsi="Calibri"/>
+            <w:color w:val="1155CC"/>
+            <w:sz w:val="19"/>
+            <w:szCs w:val="19"/>
+            <w:u w:val="single"/>
+          </w:rPr>
+          <w:t xml:space="preserve">AI_USE.md</w:t>
+        </w:r>
+      </w:hyperlink>
     </w:p>
     <w:sectPr>
       <w:pgSz w:w="12240" w:h="15840" w:orient="portrait"/>

</xml_diff>

<commit_message>
Drop the HP_ID column and the shaded table headers
</commit_message>
<xml_diff>
--- a/GPU assignments/GPU Lab 1/HW2.5_Document.docx
+++ b/GPU assignments/GPU Lab 1/HW2.5_Document.docx
@@ -87,8 +87,7 @@
         </w:tblBorders>
       </w:tblPr>
       <w:tblGrid>
-        <w:gridCol w:w="2340"/>
-        <w:gridCol w:w="2340"/>
+        <w:gridCol w:w="4680"/>
         <w:gridCol w:w="4680"/>
       </w:tblGrid>
       <w:tr>
@@ -97,8 +96,7 @@
         </w:trPr>
         <w:tc>
           <w:tcPr>
-            <w:tcW w:type="dxa" w:w="2340"/>
-            <w:shd w:fill="EFEFEC" w:color="auto" w:val="clear"/>
+            <w:tcW w:type="dxa" w:w="4680"/>
             <w:tcMar>
               <w:top w:type="dxa" w:w="60"/>
               <w:left w:type="dxa" w:w="100"/>
@@ -125,8 +123,7 @@
         </w:tc>
         <w:tc>
           <w:tcPr>
-            <w:tcW w:type="dxa" w:w="2340"/>
-            <w:shd w:fill="EFEFEC" w:color="auto" w:val="clear"/>
+            <w:tcW w:type="dxa" w:w="4680"/>
             <w:tcMar>
               <w:top w:type="dxa" w:w="60"/>
               <w:left w:type="dxa" w:w="100"/>
@@ -148,34 +145,6 @@
                 <w:szCs w:val="19"/>
               </w:rPr>
               <w:t xml:space="preserve">SEED</w:t>
-            </w:r>
-          </w:p>
-        </w:tc>
-        <w:tc>
-          <w:tcPr>
-            <w:tcW w:type="dxa" w:w="4680"/>
-            <w:shd w:fill="EFEFEC" w:color="auto" w:val="clear"/>
-            <w:tcMar>
-              <w:top w:type="dxa" w:w="60"/>
-              <w:left w:type="dxa" w:w="100"/>
-              <w:bottom w:type="dxa" w:w="60"/>
-              <w:right w:type="dxa" w:w="100"/>
-            </w:tcMar>
-          </w:tcPr>
-          <w:p>
-            <w:pPr>
-              <w:spacing w:after="0" w:line="240"/>
-            </w:pPr>
-            <w:r>
-              <w:rPr>
-                <w:rFonts w:ascii="Calibri" w:cs="Calibri" w:eastAsia="Calibri" w:hAnsi="Calibri"/>
-                <w:b/>
-                <w:bCs/>
-                <w:color w:val="1A1A1A"/>
-                <w:sz w:val="19"/>
-                <w:szCs w:val="19"/>
-              </w:rPr>
-              <w:t xml:space="preserve">HP_ID</w:t>
             </w:r>
           </w:p>
         </w:tc>
@@ -186,7 +155,7 @@
         </w:trPr>
         <w:tc>
           <w:tcPr>
-            <w:tcW w:type="dxa" w:w="2340"/>
+            <w:tcW w:type="dxa" w:w="4680"/>
             <w:tcMar>
               <w:top w:type="dxa" w:w="60"/>
               <w:left w:type="dxa" w:w="100"/>
@@ -213,7 +182,7 @@
         </w:tc>
         <w:tc>
           <w:tcPr>
-            <w:tcW w:type="dxa" w:w="2340"/>
+            <w:tcW w:type="dxa" w:w="4680"/>
             <w:tcMar>
               <w:top w:type="dxa" w:w="60"/>
               <w:left w:type="dxa" w:w="100"/>
@@ -236,34 +205,6 @@
                 <w:szCs w:val="19"/>
               </w:rPr>
               <w:t xml:space="preserve">5330</w:t>
-            </w:r>
-          </w:p>
-        </w:tc>
-        <w:tc>
-          <w:tcPr>
-            <w:tcW w:type="dxa" w:w="4680"/>
-            <w:tcMar>
-              <w:top w:type="dxa" w:w="60"/>
-              <w:left w:type="dxa" w:w="100"/>
-              <w:bottom w:type="dxa" w:w="60"/>
-              <w:right w:type="dxa" w:w="100"/>
-            </w:tcMar>
-          </w:tcPr>
-          <w:p>
-            <w:pPr>
-              <w:spacing w:after="0" w:line="240"/>
-              <w:jc w:val="right"/>
-            </w:pPr>
-            <w:r>
-              <w:rPr>
-                <w:rFonts w:ascii="Calibri" w:cs="Calibri" w:eastAsia="Calibri" w:hAnsi="Calibri"/>
-                <w:b w:val="false"/>
-                <w:bCs w:val="false"/>
-                <w:color w:val="1A1A1A"/>
-                <w:sz w:val="19"/>
-                <w:szCs w:val="19"/>
-              </w:rPr>
-              <w:t xml:space="preserve">not used in HW2.5</w:t>
             </w:r>
           </w:p>
         </w:tc>
@@ -307,7 +248,7 @@
         </w:rPr>
         <w:t xml:space="preserve">Code and artifacts:  </w:t>
       </w:r>
-      <w:hyperlink w:history="1" r:id="rIdlt4umgp8m4mq3q1ippbzt">
+      <w:hyperlink w:history="1" r:id="rId8dzwls9mvathprsuyv9a5">
         <w:r>
           <w:rPr>
             <w:rStyle w:val="Hyperlink"/>
@@ -329,7 +270,7 @@
         </w:rPr>
         <w:t xml:space="preserve">   ·   </w:t>
       </w:r>
-      <w:hyperlink w:history="1" r:id="rIdoznwmx9ll85_hkzztxix6">
+      <w:hyperlink w:history="1" r:id="rIdlsx7cfpf2usgdv6atltm3">
         <w:r>
           <w:rPr>
             <w:rStyle w:val="Hyperlink"/>
@@ -351,7 +292,7 @@
         </w:rPr>
         <w:t xml:space="preserve">   ·   </w:t>
       </w:r>
-      <w:hyperlink w:history="1" r:id="rIdgqbpluogdokwfajuqf4b_">
+      <w:hyperlink w:history="1" r:id="rIdve9xjhronhupdpmpfiahe">
         <w:r>
           <w:rPr>
             <w:rStyle w:val="Hyperlink"/>
@@ -373,7 +314,7 @@
         </w:rPr>
         <w:t xml:space="preserve">   ·   </w:t>
       </w:r>
-      <w:hyperlink w:history="1" r:id="rId6ghcjifqb0vtxybmlnnuf">
+      <w:hyperlink w:history="1" r:id="rIdd4rjmn5_rwwexkm0n1nfm">
         <w:r>
           <w:rPr>
             <w:rStyle w:val="Hyperlink"/>
@@ -433,7 +374,6 @@
         <w:tc>
           <w:tcPr>
             <w:tcW w:type="dxa" w:w="3120"/>
-            <w:shd w:fill="EFEFEC" w:color="auto" w:val="clear"/>
             <w:tcMar>
               <w:top w:type="dxa" w:w="60"/>
               <w:left w:type="dxa" w:w="100"/>
@@ -461,7 +401,6 @@
         <w:tc>
           <w:tcPr>
             <w:tcW w:type="dxa" w:w="6240"/>
-            <w:shd w:fill="EFEFEC" w:color="auto" w:val="clear"/>
             <w:tcMar>
               <w:top w:type="dxa" w:w="60"/>
               <w:left w:type="dxa" w:w="100"/>
@@ -1000,7 +939,6 @@
         <w:tc>
           <w:tcPr>
             <w:tcW w:type="dxa" w:w="3120"/>
-            <w:shd w:fill="EFEFEC" w:color="auto" w:val="clear"/>
             <w:tcMar>
               <w:top w:type="dxa" w:w="60"/>
               <w:left w:type="dxa" w:w="100"/>
@@ -1028,7 +966,6 @@
         <w:tc>
           <w:tcPr>
             <w:tcW w:type="dxa" w:w="6240"/>
-            <w:shd w:fill="EFEFEC" w:color="auto" w:val="clear"/>
             <w:tcMar>
               <w:top w:type="dxa" w:w="60"/>
               <w:left w:type="dxa" w:w="100"/>
@@ -1592,7 +1529,7 @@
         </w:rPr>
         <w:t xml:space="preserve">Code and artifacts:  </w:t>
       </w:r>
-      <w:hyperlink w:history="1" r:id="rId9ljslubwdhr8eboxrdfbb">
+      <w:hyperlink w:history="1" r:id="rIdkrf-banz6r75aynewci4i">
         <w:r>
           <w:rPr>
             <w:rStyle w:val="Hyperlink"/>
@@ -1614,7 +1551,7 @@
         </w:rPr>
         <w:t xml:space="preserve">   ·   </w:t>
       </w:r>
-      <w:hyperlink w:history="1" r:id="rIdgcaxyjjtn3le9408161fz">
+      <w:hyperlink w:history="1" r:id="rIdebnngjadaxcf_fcoipbz2">
         <w:r>
           <w:rPr>
             <w:rStyle w:val="Hyperlink"/>
@@ -1636,7 +1573,7 @@
         </w:rPr>
         <w:t xml:space="preserve">   ·   </w:t>
       </w:r>
-      <w:hyperlink w:history="1" r:id="rIdk5pfyyphyfqvvustbglyo">
+      <w:hyperlink w:history="1" r:id="rId4ihlqu3trhc8m-pejilpu">
         <w:r>
           <w:rPr>
             <w:rStyle w:val="Hyperlink"/>
@@ -1692,7 +1629,6 @@
         <w:tc>
           <w:tcPr>
             <w:tcW w:type="dxa" w:w="1248"/>
-            <w:shd w:fill="EFEFEC" w:color="auto" w:val="clear"/>
             <w:tcMar>
               <w:top w:type="dxa" w:w="60"/>
               <w:left w:type="dxa" w:w="100"/>
@@ -1720,7 +1656,6 @@
         <w:tc>
           <w:tcPr>
             <w:tcW w:type="dxa" w:w="1373"/>
-            <w:shd w:fill="EFEFEC" w:color="auto" w:val="clear"/>
             <w:tcMar>
               <w:top w:type="dxa" w:w="60"/>
               <w:left w:type="dxa" w:w="100"/>
@@ -1748,7 +1683,6 @@
         <w:tc>
           <w:tcPr>
             <w:tcW w:type="dxa" w:w="1872"/>
-            <w:shd w:fill="EFEFEC" w:color="auto" w:val="clear"/>
             <w:tcMar>
               <w:top w:type="dxa" w:w="60"/>
               <w:left w:type="dxa" w:w="100"/>
@@ -1776,7 +1710,6 @@
         <w:tc>
           <w:tcPr>
             <w:tcW w:type="dxa" w:w="1373"/>
-            <w:shd w:fill="EFEFEC" w:color="auto" w:val="clear"/>
             <w:tcMar>
               <w:top w:type="dxa" w:w="60"/>
               <w:left w:type="dxa" w:w="100"/>
@@ -1804,7 +1737,6 @@
         <w:tc>
           <w:tcPr>
             <w:tcW w:type="dxa" w:w="1373"/>
-            <w:shd w:fill="EFEFEC" w:color="auto" w:val="clear"/>
             <w:tcMar>
               <w:top w:type="dxa" w:w="60"/>
               <w:left w:type="dxa" w:w="100"/>
@@ -1832,7 +1764,6 @@
         <w:tc>
           <w:tcPr>
             <w:tcW w:type="dxa" w:w="998"/>
-            <w:shd w:fill="EFEFEC" w:color="auto" w:val="clear"/>
             <w:tcMar>
               <w:top w:type="dxa" w:w="60"/>
               <w:left w:type="dxa" w:w="100"/>
@@ -1860,7 +1791,6 @@
         <w:tc>
           <w:tcPr>
             <w:tcW w:type="dxa" w:w="1123"/>
-            <w:shd w:fill="EFEFEC" w:color="auto" w:val="clear"/>
             <w:tcMar>
               <w:top w:type="dxa" w:w="60"/>
               <w:left w:type="dxa" w:w="100"/>
@@ -5998,7 +5928,6 @@
         <w:tc>
           <w:tcPr>
             <w:tcW w:type="dxa" w:w="1872"/>
-            <w:shd w:fill="EFEFEC" w:color="auto" w:val="clear"/>
             <w:tcMar>
               <w:top w:type="dxa" w:w="60"/>
               <w:left w:type="dxa" w:w="100"/>
@@ -6026,7 +5955,6 @@
         <w:tc>
           <w:tcPr>
             <w:tcW w:type="dxa" w:w="1872"/>
-            <w:shd w:fill="EFEFEC" w:color="auto" w:val="clear"/>
             <w:tcMar>
               <w:top w:type="dxa" w:w="60"/>
               <w:left w:type="dxa" w:w="100"/>
@@ -6054,7 +5982,6 @@
         <w:tc>
           <w:tcPr>
             <w:tcW w:type="dxa" w:w="1872"/>
-            <w:shd w:fill="EFEFEC" w:color="auto" w:val="clear"/>
             <w:tcMar>
               <w:top w:type="dxa" w:w="60"/>
               <w:left w:type="dxa" w:w="100"/>
@@ -6082,7 +6009,6 @@
         <w:tc>
           <w:tcPr>
             <w:tcW w:type="dxa" w:w="3744"/>
-            <w:shd w:fill="EFEFEC" w:color="auto" w:val="clear"/>
             <w:tcMar>
               <w:top w:type="dxa" w:w="60"/>
               <w:left w:type="dxa" w:w="100"/>
@@ -6806,7 +6732,7 @@
         </w:rPr>
         <w:t xml:space="preserve">Code and artifacts:  </w:t>
       </w:r>
-      <w:hyperlink w:history="1" r:id="rIddelsvrb-2af56tir4fk2-">
+      <w:hyperlink w:history="1" r:id="rIdajfv85zn7-hi6w8o7h0tk">
         <w:r>
           <w:rPr>
             <w:rStyle w:val="Hyperlink"/>
@@ -6828,7 +6754,7 @@
         </w:rPr>
         <w:t xml:space="preserve">   ·   </w:t>
       </w:r>
-      <w:hyperlink w:history="1" r:id="rIddp7wfepbvyc3qc0g897on">
+      <w:hyperlink w:history="1" r:id="rIdskvjdca1kxyuns0g9ntcg">
         <w:r>
           <w:rPr>
             <w:rStyle w:val="Hyperlink"/>
@@ -6850,7 +6776,7 @@
         </w:rPr>
         <w:t xml:space="preserve">   ·   </w:t>
       </w:r>
-      <w:hyperlink w:history="1" r:id="rIdkclzhhurwsi3omei8mlmg">
+      <w:hyperlink w:history="1" r:id="rId5wmj9pwgvd3rnojnn0m2o">
         <w:r>
           <w:rPr>
             <w:rStyle w:val="Hyperlink"/>
@@ -6905,7 +6831,6 @@
         <w:tc>
           <w:tcPr>
             <w:tcW w:type="dxa" w:w="1950"/>
-            <w:shd w:fill="EFEFEC" w:color="auto" w:val="clear"/>
             <w:tcMar>
               <w:top w:type="dxa" w:w="60"/>
               <w:left w:type="dxa" w:w="100"/>
@@ -6933,7 +6858,6 @@
         <w:tc>
           <w:tcPr>
             <w:tcW w:type="dxa" w:w="1430"/>
-            <w:shd w:fill="EFEFEC" w:color="auto" w:val="clear"/>
             <w:tcMar>
               <w:top w:type="dxa" w:w="60"/>
               <w:left w:type="dxa" w:w="100"/>
@@ -6961,7 +6885,6 @@
         <w:tc>
           <w:tcPr>
             <w:tcW w:type="dxa" w:w="1170"/>
-            <w:shd w:fill="EFEFEC" w:color="auto" w:val="clear"/>
             <w:tcMar>
               <w:top w:type="dxa" w:w="60"/>
               <w:left w:type="dxa" w:w="100"/>
@@ -6989,7 +6912,6 @@
         <w:tc>
           <w:tcPr>
             <w:tcW w:type="dxa" w:w="2210"/>
-            <w:shd w:fill="EFEFEC" w:color="auto" w:val="clear"/>
             <w:tcMar>
               <w:top w:type="dxa" w:w="60"/>
               <w:left w:type="dxa" w:w="100"/>
@@ -7017,7 +6939,6 @@
         <w:tc>
           <w:tcPr>
             <w:tcW w:type="dxa" w:w="1170"/>
-            <w:shd w:fill="EFEFEC" w:color="auto" w:val="clear"/>
             <w:tcMar>
               <w:top w:type="dxa" w:w="60"/>
               <w:left w:type="dxa" w:w="100"/>
@@ -7045,7 +6966,6 @@
         <w:tc>
           <w:tcPr>
             <w:tcW w:type="dxa" w:w="1430"/>
-            <w:shd w:fill="EFEFEC" w:color="auto" w:val="clear"/>
             <w:tcMar>
               <w:top w:type="dxa" w:w="60"/>
               <w:left w:type="dxa" w:w="100"/>
@@ -7694,7 +7614,7 @@
         </w:rPr>
         <w:t xml:space="preserve">Code and artifacts:  </w:t>
       </w:r>
-      <w:hyperlink w:history="1" r:id="rIdtky9yan1xzf6-vyce_brx">
+      <w:hyperlink w:history="1" r:id="rIdh0oddd4vby2ah3u5xi1gh">
         <w:r>
           <w:rPr>
             <w:rStyle w:val="Hyperlink"/>
@@ -7716,7 +7636,7 @@
         </w:rPr>
         <w:t xml:space="preserve">   ·   </w:t>
       </w:r>
-      <w:hyperlink w:history="1" r:id="rIdxg4rtqp7uv5bxadqv1ecc">
+      <w:hyperlink w:history="1" r:id="rIdsq-rxvd385-xy8sujvcta">
         <w:r>
           <w:rPr>
             <w:rStyle w:val="Hyperlink"/>
@@ -7738,7 +7658,7 @@
         </w:rPr>
         <w:t xml:space="preserve">   ·   </w:t>
       </w:r>
-      <w:hyperlink w:history="1" r:id="rIdzn8l0jric_xbne399pk0a">
+      <w:hyperlink w:history="1" r:id="rIdpqi2vaijhzb4xylzmqqfq">
         <w:r>
           <w:rPr>
             <w:rStyle w:val="Hyperlink"/>
@@ -7760,7 +7680,7 @@
         </w:rPr>
         <w:t xml:space="preserve">   ·   </w:t>
       </w:r>
-      <w:hyperlink w:history="1" r:id="rIdzctr2dmvegsnoeiejy9a5">
+      <w:hyperlink w:history="1" r:id="rId-6jgd7dqpbrfebgx_ofrq">
         <w:r>
           <w:rPr>
             <w:rStyle w:val="Hyperlink"/>
@@ -7782,7 +7702,7 @@
         </w:rPr>
         <w:t xml:space="preserve">   ·   </w:t>
       </w:r>
-      <w:hyperlink w:history="1" r:id="rIdfuhucpe0mwxiv4enmg9gf">
+      <w:hyperlink w:history="1" r:id="rId5701bgddbg6a4wwmyyhp-">
         <w:r>
           <w:rPr>
             <w:rStyle w:val="Hyperlink"/>
@@ -7837,7 +7757,6 @@
         <w:tc>
           <w:tcPr>
             <w:tcW w:type="dxa" w:w="1300"/>
-            <w:shd w:fill="EFEFEC" w:color="auto" w:val="clear"/>
             <w:tcMar>
               <w:top w:type="dxa" w:w="60"/>
               <w:left w:type="dxa" w:w="100"/>
@@ -7865,7 +7784,6 @@
         <w:tc>
           <w:tcPr>
             <w:tcW w:type="dxa" w:w="1300"/>
-            <w:shd w:fill="EFEFEC" w:color="auto" w:val="clear"/>
             <w:tcMar>
               <w:top w:type="dxa" w:w="60"/>
               <w:left w:type="dxa" w:w="100"/>
@@ -7893,7 +7811,6 @@
         <w:tc>
           <w:tcPr>
             <w:tcW w:type="dxa" w:w="1820"/>
-            <w:shd w:fill="EFEFEC" w:color="auto" w:val="clear"/>
             <w:tcMar>
               <w:top w:type="dxa" w:w="60"/>
               <w:left w:type="dxa" w:w="100"/>
@@ -7921,7 +7838,6 @@
         <w:tc>
           <w:tcPr>
             <w:tcW w:type="dxa" w:w="1560"/>
-            <w:shd w:fill="EFEFEC" w:color="auto" w:val="clear"/>
             <w:tcMar>
               <w:top w:type="dxa" w:w="60"/>
               <w:left w:type="dxa" w:w="100"/>
@@ -7949,7 +7865,6 @@
         <w:tc>
           <w:tcPr>
             <w:tcW w:type="dxa" w:w="1690"/>
-            <w:shd w:fill="EFEFEC" w:color="auto" w:val="clear"/>
             <w:tcMar>
               <w:top w:type="dxa" w:w="60"/>
               <w:left w:type="dxa" w:w="100"/>
@@ -7977,7 +7892,6 @@
         <w:tc>
           <w:tcPr>
             <w:tcW w:type="dxa" w:w="1690"/>
-            <w:shd w:fill="EFEFEC" w:color="auto" w:val="clear"/>
             <w:tcMar>
               <w:top w:type="dxa" w:w="60"/>
               <w:left w:type="dxa" w:w="100"/>
@@ -10320,7 +10234,7 @@
         </w:rPr>
         <w:t xml:space="preserve">Code and artifacts:  </w:t>
       </w:r>
-      <w:hyperlink w:history="1" r:id="rId3bt4zlwy6vbw7a1cs8nri">
+      <w:hyperlink w:history="1" r:id="rIda0pkkoeraimwnfxwwabpa">
         <w:r>
           <w:rPr>
             <w:rStyle w:val="Hyperlink"/>
@@ -10342,7 +10256,7 @@
         </w:rPr>
         <w:t xml:space="preserve">   ·   </w:t>
       </w:r>
-      <w:hyperlink w:history="1" r:id="rIdzaickx40vjfkkjqhcsiqy">
+      <w:hyperlink w:history="1" r:id="rIdppza0ooit4i6mgoqstypg">
         <w:r>
           <w:rPr>
             <w:rStyle w:val="Hyperlink"/>
@@ -10364,7 +10278,7 @@
         </w:rPr>
         <w:t xml:space="preserve">   ·   </w:t>
       </w:r>
-      <w:hyperlink w:history="1" r:id="rIdeyq7oplytjkd97ulg0yxl">
+      <w:hyperlink w:history="1" r:id="rIdq-a6tghu8iqh0fc-bgndv">
         <w:r>
           <w:rPr>
             <w:rStyle w:val="Hyperlink"/>
@@ -10386,7 +10300,7 @@
         </w:rPr>
         <w:t xml:space="preserve">   ·   </w:t>
       </w:r>
-      <w:hyperlink w:history="1" r:id="rIdcgdxvu6bbtcsnyvhhiht5">
+      <w:hyperlink w:history="1" r:id="rIdupbp9jon4tonqmpid3tl7">
         <w:r>
           <w:rPr>
             <w:rStyle w:val="Hyperlink"/>
@@ -10408,7 +10322,7 @@
         </w:rPr>
         <w:t xml:space="preserve">   ·   </w:t>
       </w:r>
-      <w:hyperlink w:history="1" r:id="rIdjfdqmbll3erxg4rcwgggo">
+      <w:hyperlink w:history="1" r:id="rIdyv3vdl5qyx16n6z42aury">
         <w:r>
           <w:rPr>
             <w:rStyle w:val="Hyperlink"/>
@@ -10459,7 +10373,6 @@
         <w:tc>
           <w:tcPr>
             <w:tcW w:type="dxa" w:w="3854"/>
-            <w:shd w:fill="EFEFEC" w:color="auto" w:val="clear"/>
             <w:tcMar>
               <w:top w:type="dxa" w:w="60"/>
               <w:left w:type="dxa" w:w="100"/>
@@ -10487,7 +10400,6 @@
         <w:tc>
           <w:tcPr>
             <w:tcW w:type="dxa" w:w="5506"/>
-            <w:shd w:fill="EFEFEC" w:color="auto" w:val="clear"/>
             <w:tcMar>
               <w:top w:type="dxa" w:w="60"/>
               <w:left w:type="dxa" w:w="100"/>
@@ -11114,7 +11026,7 @@
         </w:rPr>
         <w:t xml:space="preserve">Code and artifacts:  </w:t>
       </w:r>
-      <w:hyperlink w:history="1" r:id="rIdsdfll16ubhfy1_gltdti6">
+      <w:hyperlink w:history="1" r:id="rIdfbe4na_pr8gzgndws5xzc">
         <w:r>
           <w:rPr>
             <w:rStyle w:val="Hyperlink"/>
@@ -11136,7 +11048,7 @@
         </w:rPr>
         <w:t xml:space="preserve">   ·   </w:t>
       </w:r>
-      <w:hyperlink w:history="1" r:id="rIdz_b2amce-awrkuaemgduf">
+      <w:hyperlink w:history="1" r:id="rIddkdlmgdbhpldihd61u8hm">
         <w:r>
           <w:rPr>
             <w:rStyle w:val="Hyperlink"/>
@@ -11158,7 +11070,7 @@
         </w:rPr>
         <w:t xml:space="preserve">   ·   </w:t>
       </w:r>
-      <w:hyperlink w:history="1" r:id="rIdkqywwetlw4m9-ryl568s2">
+      <w:hyperlink w:history="1" r:id="rIdsuiwe9knjflou3eezni2y">
         <w:r>
           <w:rPr>
             <w:rStyle w:val="Hyperlink"/>
@@ -11180,7 +11092,7 @@
         </w:rPr>
         <w:t xml:space="preserve">   ·   </w:t>
       </w:r>
-      <w:hyperlink w:history="1" r:id="rId8cj53zzkd2oj3tzmlsyer">
+      <w:hyperlink w:history="1" r:id="rIdrkbxcqgj4fcx5pqhpitez">
         <w:r>
           <w:rPr>
             <w:rStyle w:val="Hyperlink"/>
@@ -11202,7 +11114,7 @@
         </w:rPr>
         <w:t xml:space="preserve">   ·   </w:t>
       </w:r>
-      <w:hyperlink w:history="1" r:id="rIdm3uvoeiiplhq8m9ets2er">
+      <w:hyperlink w:history="1" r:id="rIdbqmfkqpngrjyf2jyxqo0v">
         <w:r>
           <w:rPr>
             <w:rStyle w:val="Hyperlink"/>
@@ -11254,7 +11166,6 @@
         <w:tc>
           <w:tcPr>
             <w:tcW w:type="dxa" w:w="2880"/>
-            <w:shd w:fill="EFEFEC" w:color="auto" w:val="clear"/>
             <w:tcMar>
               <w:top w:type="dxa" w:w="60"/>
               <w:left w:type="dxa" w:w="100"/>
@@ -11282,7 +11193,6 @@
         <w:tc>
           <w:tcPr>
             <w:tcW w:type="dxa" w:w="2520"/>
-            <w:shd w:fill="EFEFEC" w:color="auto" w:val="clear"/>
             <w:tcMar>
               <w:top w:type="dxa" w:w="60"/>
               <w:left w:type="dxa" w:w="100"/>
@@ -11310,7 +11220,6 @@
         <w:tc>
           <w:tcPr>
             <w:tcW w:type="dxa" w:w="3960"/>
-            <w:shd w:fill="EFEFEC" w:color="auto" w:val="clear"/>
             <w:tcMar>
               <w:top w:type="dxa" w:w="60"/>
               <w:left w:type="dxa" w:w="100"/>
@@ -12088,7 +11997,7 @@
         </w:rPr>
         <w:t xml:space="preserve">Code and artifacts:  </w:t>
       </w:r>
-      <w:hyperlink w:history="1" r:id="rId04wyaej_ij44y4wgtshvm">
+      <w:hyperlink w:history="1" r:id="rId8ams-joqxmfgcdqk8psx8">
         <w:r>
           <w:rPr>
             <w:rStyle w:val="Hyperlink"/>
@@ -12125,7 +12034,6 @@
         <w:tc>
           <w:tcPr>
             <w:tcW w:type="dxa" w:w="3120"/>
-            <w:shd w:fill="EFEFEC" w:color="auto" w:val="clear"/>
             <w:tcMar>
               <w:top w:type="dxa" w:w="60"/>
               <w:left w:type="dxa" w:w="100"/>
@@ -12153,7 +12061,6 @@
         <w:tc>
           <w:tcPr>
             <w:tcW w:type="dxa" w:w="6240"/>
-            <w:shd w:fill="EFEFEC" w:color="auto" w:val="clear"/>
             <w:tcMar>
               <w:top w:type="dxa" w:w="60"/>
               <w:left w:type="dxa" w:w="100"/>
@@ -12605,7 +12512,6 @@
         <w:tc>
           <w:tcPr>
             <w:tcW w:type="dxa" w:w="4306"/>
-            <w:shd w:fill="EFEFEC" w:color="auto" w:val="clear"/>
             <w:tcMar>
               <w:top w:type="dxa" w:w="60"/>
               <w:left w:type="dxa" w:w="100"/>
@@ -12633,7 +12539,6 @@
         <w:tc>
           <w:tcPr>
             <w:tcW w:type="dxa" w:w="5054"/>
-            <w:shd w:fill="EFEFEC" w:color="auto" w:val="clear"/>
             <w:tcMar>
               <w:top w:type="dxa" w:w="60"/>
               <w:left w:type="dxa" w:w="100"/>
@@ -12674,7 +12579,7 @@
             <w:pPr>
               <w:spacing w:after="0" w:line="240"/>
             </w:pPr>
-            <w:hyperlink w:history="1" r:id="rIda0zsykhvqpjf6ro7trcdq">
+            <w:hyperlink w:history="1" r:id="rIdhaofxwjn9lzac_k0d82wa">
               <w:r>
                 <w:rPr>
                   <w:rStyle w:val="Hyperlink"/>
@@ -12732,7 +12637,7 @@
             <w:pPr>
               <w:spacing w:after="0" w:line="240"/>
             </w:pPr>
-            <w:hyperlink w:history="1" r:id="rIdmwpqp9nzmvcxkhcbunyhl">
+            <w:hyperlink w:history="1" r:id="rIdnatsqhcxrytpr4tg6ndtc">
               <w:r>
                 <w:rPr>
                   <w:rStyle w:val="Hyperlink"/>
@@ -12790,7 +12695,7 @@
             <w:pPr>
               <w:spacing w:after="0" w:line="240"/>
             </w:pPr>
-            <w:hyperlink w:history="1" r:id="rIdgudq9-my7w3hg8mvjd2d1">
+            <w:hyperlink w:history="1" r:id="rId-8xdtcxmd3grvrje2z5lc">
               <w:r>
                 <w:rPr>
                   <w:rStyle w:val="Hyperlink"/>
@@ -12848,7 +12753,7 @@
             <w:pPr>
               <w:spacing w:after="0" w:line="240"/>
             </w:pPr>
-            <w:hyperlink w:history="1" r:id="rIdp-z8qvxfruxdp5kbj1ziw">
+            <w:hyperlink w:history="1" r:id="rId6jjzqexjemrul2unkslig">
               <w:r>
                 <w:rPr>
                   <w:rStyle w:val="Hyperlink"/>
@@ -12906,7 +12811,7 @@
             <w:pPr>
               <w:spacing w:after="0" w:line="240"/>
             </w:pPr>
-            <w:hyperlink w:history="1" r:id="rId0evowqifoh9337cycoyzv">
+            <w:hyperlink w:history="1" r:id="rIdiqw9lgp0su2gdaou08fa2">
               <w:r>
                 <w:rPr>
                   <w:rStyle w:val="Hyperlink"/>
@@ -12964,7 +12869,7 @@
             <w:pPr>
               <w:spacing w:after="0" w:line="240"/>
             </w:pPr>
-            <w:hyperlink w:history="1" r:id="rIdkaiyay9dxcglcuor5q8i8">
+            <w:hyperlink w:history="1" r:id="rId471oeqntfh6ihkahscmxx">
               <w:r>
                 <w:rPr>
                   <w:rStyle w:val="Hyperlink"/>
@@ -13022,7 +12927,7 @@
             <w:pPr>
               <w:spacing w:after="0" w:line="240"/>
             </w:pPr>
-            <w:hyperlink w:history="1" r:id="rId5ybbslgf4fe6-nf4ui38o">
+            <w:hyperlink w:history="1" r:id="rId732dvtjrmbmtkf7385_6x">
               <w:r>
                 <w:rPr>
                   <w:rStyle w:val="Hyperlink"/>
@@ -13080,7 +12985,7 @@
             <w:pPr>
               <w:spacing w:after="0" w:line="240"/>
             </w:pPr>
-            <w:hyperlink w:history="1" r:id="rIdc-upf3qclsnv5paqhjmsa">
+            <w:hyperlink w:history="1" r:id="rIdzuy6u1eyaagj8vquye61g">
               <w:r>
                 <w:rPr>
                   <w:rStyle w:val="Hyperlink"/>
@@ -13138,7 +13043,7 @@
             <w:pPr>
               <w:spacing w:after="0" w:line="240"/>
             </w:pPr>
-            <w:hyperlink w:history="1" r:id="rIdgomspu4gnwogfoolfv1qz">
+            <w:hyperlink w:history="1" r:id="rIdpd3bvxfb2xooyraf9fjfc">
               <w:r>
                 <w:rPr>
                   <w:rStyle w:val="Hyperlink"/>
@@ -13196,7 +13101,7 @@
             <w:pPr>
               <w:spacing w:after="0" w:line="240"/>
             </w:pPr>
-            <w:hyperlink w:history="1" r:id="rId8ekywmew5m3yvs5lucxwp">
+            <w:hyperlink w:history="1" r:id="rIdfly_pb37nqtkmrtpkmiaa">
               <w:r>
                 <w:rPr>
                   <w:rStyle w:val="Hyperlink"/>
@@ -13254,7 +13159,7 @@
             <w:pPr>
               <w:spacing w:after="0" w:line="240"/>
             </w:pPr>
-            <w:hyperlink w:history="1" r:id="rIdnhinqyrsting9cslwy-xh">
+            <w:hyperlink w:history="1" r:id="rIdpohjf9ovbcbxvrpadahuv">
               <w:r>
                 <w:rPr>
                   <w:rStyle w:val="Hyperlink"/>
@@ -13312,7 +13217,7 @@
             <w:pPr>
               <w:spacing w:after="0" w:line="240"/>
             </w:pPr>
-            <w:hyperlink w:history="1" r:id="rIduhep5w6zep_paqnleuvs1">
+            <w:hyperlink w:history="1" r:id="rIdg5n0erc3bivt5oj8tphtv">
               <w:r>
                 <w:rPr>
                   <w:rStyle w:val="Hyperlink"/>
@@ -13370,7 +13275,7 @@
             <w:pPr>
               <w:spacing w:after="0" w:line="240"/>
             </w:pPr>
-            <w:hyperlink w:history="1" r:id="rIdrx3-5hubcliaz8dxemajr">
+            <w:hyperlink w:history="1" r:id="rId6yyh1phe6qalxbbf-q4eq">
               <w:r>
                 <w:rPr>
                   <w:rStyle w:val="Hyperlink"/>
@@ -13428,7 +13333,7 @@
             <w:pPr>
               <w:spacing w:after="0" w:line="240"/>
             </w:pPr>
-            <w:hyperlink w:history="1" r:id="rIdeffixiyciwxfm-gue94qv">
+            <w:hyperlink w:history="1" r:id="rIduj3slzb5pauexhprxqt--">
               <w:r>
                 <w:rPr>
                   <w:rStyle w:val="Hyperlink"/>
@@ -13486,7 +13391,7 @@
             <w:pPr>
               <w:spacing w:after="0" w:line="240"/>
             </w:pPr>
-            <w:hyperlink w:history="1" r:id="rId6s4of_vbaixxmelurlxak">
+            <w:hyperlink w:history="1" r:id="rId5arlv1o1qwmclxux8rscw">
               <w:r>
                 <w:rPr>
                   <w:rStyle w:val="Hyperlink"/>
@@ -13544,7 +13449,7 @@
             <w:pPr>
               <w:spacing w:after="0" w:line="240"/>
             </w:pPr>
-            <w:hyperlink w:history="1" r:id="rIde-qll4gjz-736h9jbeg9s">
+            <w:hyperlink w:history="1" r:id="rIddwkxgulp-cbaazqi6fed0">
               <w:r>
                 <w:rPr>
                   <w:rStyle w:val="Hyperlink"/>
@@ -13602,7 +13507,7 @@
             <w:pPr>
               <w:spacing w:after="0" w:line="240"/>
             </w:pPr>
-            <w:hyperlink w:history="1" r:id="rIdhfqhyxnwvdm--oow0fkgr">
+            <w:hyperlink w:history="1" r:id="rIdedjfjjbc594i8pnfc-acf">
               <w:r>
                 <w:rPr>
                   <w:rStyle w:val="Hyperlink"/>
@@ -13660,7 +13565,7 @@
             <w:pPr>
               <w:spacing w:after="0" w:line="240"/>
             </w:pPr>
-            <w:hyperlink w:history="1" r:id="rIdikbiwtc9bfync0rxyvavl">
+            <w:hyperlink w:history="1" r:id="rId3bxnlwxr4zzd0ht0tyjxs">
               <w:r>
                 <w:rPr>
                   <w:rStyle w:val="Hyperlink"/>
@@ -13718,7 +13623,7 @@
             <w:pPr>
               <w:spacing w:after="0" w:line="240"/>
             </w:pPr>
-            <w:hyperlink w:history="1" r:id="rIdy-fdvpkq6faysost9ycz5">
+            <w:hyperlink w:history="1" r:id="rIdwra_k7_erb923zaaczyss">
               <w:r>
                 <w:rPr>
                   <w:rStyle w:val="Hyperlink"/>
@@ -13776,7 +13681,7 @@
             <w:pPr>
               <w:spacing w:after="0" w:line="240"/>
             </w:pPr>
-            <w:hyperlink w:history="1" r:id="rIdl4ckh77tbnuhxzvbfrycb">
+            <w:hyperlink w:history="1" r:id="rIdto533vcngi3xzcnziwuna">
               <w:r>
                 <w:rPr>
                   <w:rStyle w:val="Hyperlink"/>
@@ -13834,7 +13739,7 @@
             <w:pPr>
               <w:spacing w:after="0" w:line="240"/>
             </w:pPr>
-            <w:hyperlink w:history="1" r:id="rId8oudnyol4kxhstf24f55f">
+            <w:hyperlink w:history="1" r:id="rId1dkoo-voqjsgmzov1lfqv">
               <w:r>
                 <w:rPr>
                   <w:rStyle w:val="Hyperlink"/>
@@ -13892,7 +13797,7 @@
             <w:pPr>
               <w:spacing w:after="0" w:line="240"/>
             </w:pPr>
-            <w:hyperlink w:history="1" r:id="rIdz_ygr1x8abs2i1w9heicv">
+            <w:hyperlink w:history="1" r:id="rId7qxivsgxkrbrvlm7eoij_">
               <w:r>
                 <w:rPr>
                   <w:rStyle w:val="Hyperlink"/>
@@ -13950,7 +13855,7 @@
             <w:pPr>
               <w:spacing w:after="0" w:line="240"/>
             </w:pPr>
-            <w:hyperlink w:history="1" r:id="rId-gtkz6ctymg6afchoyoip">
+            <w:hyperlink w:history="1" r:id="rIdfof2brdkhjodeljv3flby">
               <w:r>
                 <w:rPr>
                   <w:rStyle w:val="Hyperlink"/>
@@ -14008,7 +13913,7 @@
             <w:pPr>
               <w:spacing w:after="0" w:line="240"/>
             </w:pPr>
-            <w:hyperlink w:history="1" r:id="rIdb4glwmsukma9vte8pqgr0">
+            <w:hyperlink w:history="1" r:id="rIdlzkqmd6dflseo_0qpi8dw">
               <w:r>
                 <w:rPr>
                   <w:rStyle w:val="Hyperlink"/>
@@ -14066,7 +13971,7 @@
             <w:pPr>
               <w:spacing w:after="0" w:line="240"/>
             </w:pPr>
-            <w:hyperlink w:history="1" r:id="rIdg4oc-2kefut_mrd2v9brt">
+            <w:hyperlink w:history="1" r:id="rIdahpisvxjjoftka6ov8fxj">
               <w:r>
                 <w:rPr>
                   <w:rStyle w:val="Hyperlink"/>
@@ -14124,7 +14029,7 @@
             <w:pPr>
               <w:spacing w:after="0" w:line="240"/>
             </w:pPr>
-            <w:hyperlink w:history="1" r:id="rIdrrldbanix2sz960txoupv">
+            <w:hyperlink w:history="1" r:id="rIdzdq8e0u9wdgg2t5g4zh92">
               <w:r>
                 <w:rPr>
                   <w:rStyle w:val="Hyperlink"/>
@@ -14182,7 +14087,7 @@
             <w:pPr>
               <w:spacing w:after="0" w:line="240"/>
             </w:pPr>
-            <w:hyperlink w:history="1" r:id="rIde5ghdm23vyu_tpwezxumz">
+            <w:hyperlink w:history="1" r:id="rIdrpuez0ql0a94jfjsgc9yv">
               <w:r>
                 <w:rPr>
                   <w:rStyle w:val="Hyperlink"/>
@@ -14240,7 +14145,7 @@
             <w:pPr>
               <w:spacing w:after="0" w:line="240"/>
             </w:pPr>
-            <w:hyperlink w:history="1" r:id="rIdntolerfp4mbgs3uh8cyan">
+            <w:hyperlink w:history="1" r:id="rIdmlzm493p1whxgtrida1gx">
               <w:r>
                 <w:rPr>
                   <w:rStyle w:val="Hyperlink"/>
@@ -14298,7 +14203,7 @@
             <w:pPr>
               <w:spacing w:after="0" w:line="240"/>
             </w:pPr>
-            <w:hyperlink w:history="1" r:id="rIdxzkwqhlmiydgqumc-x8n6">
+            <w:hyperlink w:history="1" r:id="rIdhxoekmjn8_tvjkc3vdtnt">
               <w:r>
                 <w:rPr>
                   <w:rStyle w:val="Hyperlink"/>
@@ -14356,7 +14261,7 @@
             <w:pPr>
               <w:spacing w:after="0" w:line="240"/>
             </w:pPr>
-            <w:hyperlink w:history="1" r:id="rIdoiyln30iqzgi0dkvehb2z">
+            <w:hyperlink w:history="1" r:id="rIdjiv1yqgwdtdwgertmh-o-">
               <w:r>
                 <w:rPr>
                   <w:rStyle w:val="Hyperlink"/>
@@ -14414,7 +14319,7 @@
             <w:pPr>
               <w:spacing w:after="0" w:line="240"/>
             </w:pPr>
-            <w:hyperlink w:history="1" r:id="rIdor5f4-yvkh6or_2bhrpnc">
+            <w:hyperlink w:history="1" r:id="rIdrc9g1lrpguj7zg14luuw6">
               <w:r>
                 <w:rPr>
                   <w:rStyle w:val="Hyperlink"/>
@@ -14472,7 +14377,7 @@
             <w:pPr>
               <w:spacing w:after="0" w:line="240"/>
             </w:pPr>
-            <w:hyperlink w:history="1" r:id="rIdi5kjak-ipqk2acipch5d1">
+            <w:hyperlink w:history="1" r:id="rId_mjksjwhcsqzesn0qgpch">
               <w:r>
                 <w:rPr>
                   <w:rStyle w:val="Hyperlink"/>
@@ -14530,7 +14435,7 @@
             <w:pPr>
               <w:spacing w:after="0" w:line="240"/>
             </w:pPr>
-            <w:hyperlink w:history="1" r:id="rIdd0jnyjzywweuyl3pna-wv">
+            <w:hyperlink w:history="1" r:id="rId88zoyns9hyoi9o0h2ixux">
               <w:r>
                 <w:rPr>
                   <w:rStyle w:val="Hyperlink"/>
@@ -14588,7 +14493,7 @@
             <w:pPr>
               <w:spacing w:after="0" w:line="240"/>
             </w:pPr>
-            <w:hyperlink w:history="1" r:id="rIdbzpj5xg7ibzct4q2udzty">
+            <w:hyperlink w:history="1" r:id="rIdtyhoujpqwftam5kyhkv6j">
               <w:r>
                 <w:rPr>
                   <w:rStyle w:val="Hyperlink"/>
@@ -14646,7 +14551,7 @@
             <w:pPr>
               <w:spacing w:after="0" w:line="240"/>
             </w:pPr>
-            <w:hyperlink w:history="1" r:id="rIdjihrrp4layqexpoh-la52">
+            <w:hyperlink w:history="1" r:id="rIdnh1tll_db3b-303tdeqo6">
               <w:r>
                 <w:rPr>
                   <w:rStyle w:val="Hyperlink"/>
@@ -14712,7 +14617,7 @@
         </w:rPr>
         <w:t xml:space="preserve">All code, data, logs, figures and generated tables are committed and tagged hw2-5 at </w:t>
       </w:r>
-      <w:hyperlink w:history="1" r:id="rIdp9wstnmobx1bfn7wggnlo">
+      <w:hyperlink w:history="1" r:id="rId4qowklt3dx-qhamnyp6fj">
         <w:r>
           <w:rPr>
             <w:rStyle w:val="Hyperlink"/>
@@ -14739,7 +14644,7 @@
       <w:pPr>
         <w:spacing w:after="120" w:line="276"/>
       </w:pPr>
-      <w:hyperlink w:history="1" r:id="rIdgy9__ctqt1lpkdmueaa6t">
+      <w:hyperlink w:history="1" r:id="rIdfbzssuzqooe-uippocm65">
         <w:r>
           <w:rPr>
             <w:rStyle w:val="Hyperlink"/>

</xml_diff>

<commit_message>
Move the denominator explanation to where the question arises
</commit_message>
<xml_diff>
--- a/GPU assignments/GPU Lab 1/HW2.5_Document.docx
+++ b/GPU assignments/GPU Lab 1/HW2.5_Document.docx
@@ -248,7 +248,7 @@
         </w:rPr>
         <w:t xml:space="preserve">Code and artifacts:  </w:t>
       </w:r>
-      <w:hyperlink w:history="1" r:id="rId8dzwls9mvathprsuyv9a5">
+      <w:hyperlink w:history="1" r:id="rIdzhyfsctkgzzqjigksnorl">
         <w:r>
           <w:rPr>
             <w:rStyle w:val="Hyperlink"/>
@@ -270,7 +270,7 @@
         </w:rPr>
         <w:t xml:space="preserve">   ·   </w:t>
       </w:r>
-      <w:hyperlink w:history="1" r:id="rIdlsx7cfpf2usgdv6atltm3">
+      <w:hyperlink w:history="1" r:id="rIdhgreqy8gzq6hqlph-_exn">
         <w:r>
           <w:rPr>
             <w:rStyle w:val="Hyperlink"/>
@@ -292,7 +292,7 @@
         </w:rPr>
         <w:t xml:space="preserve">   ·   </w:t>
       </w:r>
-      <w:hyperlink w:history="1" r:id="rIdve9xjhronhupdpmpfiahe">
+      <w:hyperlink w:history="1" r:id="rId7nxim30uypqu-c3ajgfk1">
         <w:r>
           <w:rPr>
             <w:rStyle w:val="Hyperlink"/>
@@ -314,7 +314,7 @@
         </w:rPr>
         <w:t xml:space="preserve">   ·   </w:t>
       </w:r>
-      <w:hyperlink w:history="1" r:id="rIdd4rjmn5_rwwexkm0n1nfm">
+      <w:hyperlink w:history="1" r:id="rIdlze9u1gobo7lxe_yef_s7">
         <w:r>
           <w:rPr>
             <w:rStyle w:val="Hyperlink"/>
@@ -1497,7 +1497,7 @@
           <w:sz w:val="21"/>
           <w:szCs w:val="21"/>
         </w:rPr>
-        <w:t xml:space="preserve">All peak figures above are dense, not sparse, and for the tensor rows they are the FP32 accumulate variant, because torch.matmul accumulates in FP32. The whitepaper prints each tensor row as dense/sparse, so using the sparse column would halve the reported efficiency. The product page headline of 3352 AI TOPS is the FP4 sparse figure, exactly twice the 1676 dense rate.</w:t>
+        <w:t xml:space="preserve">The peak figures above are the dense, FP32 accumulate variants. Section 7.1 explains why that choice matters and why no smaller denominator was available.</w:t>
       </w:r>
     </w:p>
     <w:p>
@@ -1529,7 +1529,7 @@
         </w:rPr>
         <w:t xml:space="preserve">Code and artifacts:  </w:t>
       </w:r>
-      <w:hyperlink w:history="1" r:id="rIdkrf-banz6r75aynewci4i">
+      <w:hyperlink w:history="1" r:id="rIdbrsoomvcpojooguboa-iu">
         <w:r>
           <w:rPr>
             <w:rStyle w:val="Hyperlink"/>
@@ -1551,7 +1551,7 @@
         </w:rPr>
         <w:t xml:space="preserve">   ·   </w:t>
       </w:r>
-      <w:hyperlink w:history="1" r:id="rIdebnngjadaxcf_fcoipbz2">
+      <w:hyperlink w:history="1" r:id="rIdd9dcjf0muaqnbo8spdntz">
         <w:r>
           <w:rPr>
             <w:rStyle w:val="Hyperlink"/>
@@ -1573,7 +1573,7 @@
         </w:rPr>
         <w:t xml:space="preserve">   ·   </w:t>
       </w:r>
-      <w:hyperlink w:history="1" r:id="rId4ihlqu3trhc8m-pejilpu">
+      <w:hyperlink w:history="1" r:id="rIdywnnbqtiv_945yw9ufvxv">
         <w:r>
           <w:rPr>
             <w:rStyle w:val="Hyperlink"/>
@@ -6732,7 +6732,7 @@
         </w:rPr>
         <w:t xml:space="preserve">Code and artifacts:  </w:t>
       </w:r>
-      <w:hyperlink w:history="1" r:id="rIdajfv85zn7-hi6w8o7h0tk">
+      <w:hyperlink w:history="1" r:id="rId93aqlo-rf8klen_ot684x">
         <w:r>
           <w:rPr>
             <w:rStyle w:val="Hyperlink"/>
@@ -6754,7 +6754,7 @@
         </w:rPr>
         <w:t xml:space="preserve">   ·   </w:t>
       </w:r>
-      <w:hyperlink w:history="1" r:id="rIdskvjdca1kxyuns0g9ntcg">
+      <w:hyperlink w:history="1" r:id="rIdsb3r6se3lhrirgngpbc28">
         <w:r>
           <w:rPr>
             <w:rStyle w:val="Hyperlink"/>
@@ -6776,7 +6776,7 @@
         </w:rPr>
         <w:t xml:space="preserve">   ·   </w:t>
       </w:r>
-      <w:hyperlink w:history="1" r:id="rId5wmj9pwgvd3rnojnn0m2o">
+      <w:hyperlink w:history="1" r:id="rId0czog4ipy2txf2apfsyqv">
         <w:r>
           <w:rPr>
             <w:rStyle w:val="Hyperlink"/>
@@ -7614,7 +7614,7 @@
         </w:rPr>
         <w:t xml:space="preserve">Code and artifacts:  </w:t>
       </w:r>
-      <w:hyperlink w:history="1" r:id="rIdh0oddd4vby2ah3u5xi1gh">
+      <w:hyperlink w:history="1" r:id="rIdtqahmqfvisapvh5ghn9f5">
         <w:r>
           <w:rPr>
             <w:rStyle w:val="Hyperlink"/>
@@ -7636,7 +7636,7 @@
         </w:rPr>
         <w:t xml:space="preserve">   ·   </w:t>
       </w:r>
-      <w:hyperlink w:history="1" r:id="rIdsq-rxvd385-xy8sujvcta">
+      <w:hyperlink w:history="1" r:id="rId38m5gk5vqho4g6oudksrr">
         <w:r>
           <w:rPr>
             <w:rStyle w:val="Hyperlink"/>
@@ -7658,7 +7658,7 @@
         </w:rPr>
         <w:t xml:space="preserve">   ·   </w:t>
       </w:r>
-      <w:hyperlink w:history="1" r:id="rIdpqi2vaijhzb4xylzmqqfq">
+      <w:hyperlink w:history="1" r:id="rId1lerfl92yxepdjzml2p8e">
         <w:r>
           <w:rPr>
             <w:rStyle w:val="Hyperlink"/>
@@ -7680,7 +7680,7 @@
         </w:rPr>
         <w:t xml:space="preserve">   ·   </w:t>
       </w:r>
-      <w:hyperlink w:history="1" r:id="rId-6jgd7dqpbrfebgx_ofrq">
+      <w:hyperlink w:history="1" r:id="rIdpli8oqchagqt1hnqddr--">
         <w:r>
           <w:rPr>
             <w:rStyle w:val="Hyperlink"/>
@@ -7702,7 +7702,7 @@
         </w:rPr>
         <w:t xml:space="preserve">   ·   </w:t>
       </w:r>
-      <w:hyperlink w:history="1" r:id="rId5701bgddbg6a4wwmyyhp-">
+      <w:hyperlink w:history="1" r:id="rIdlvhhpjy6zgdhjztlgq9kc">
         <w:r>
           <w:rPr>
             <w:rStyle w:val="Hyperlink"/>
@@ -10234,7 +10234,7 @@
         </w:rPr>
         <w:t xml:space="preserve">Code and artifacts:  </w:t>
       </w:r>
-      <w:hyperlink w:history="1" r:id="rIda0pkkoeraimwnfxwwabpa">
+      <w:hyperlink w:history="1" r:id="rIdya3tmvqp2bh-4powzunpb">
         <w:r>
           <w:rPr>
             <w:rStyle w:val="Hyperlink"/>
@@ -10256,7 +10256,7 @@
         </w:rPr>
         <w:t xml:space="preserve">   ·   </w:t>
       </w:r>
-      <w:hyperlink w:history="1" r:id="rIdppza0ooit4i6mgoqstypg">
+      <w:hyperlink w:history="1" r:id="rIdniwe4v4ovef2kqj5lc-mt">
         <w:r>
           <w:rPr>
             <w:rStyle w:val="Hyperlink"/>
@@ -10278,7 +10278,7 @@
         </w:rPr>
         <w:t xml:space="preserve">   ·   </w:t>
       </w:r>
-      <w:hyperlink w:history="1" r:id="rIdq-a6tghu8iqh0fc-bgndv">
+      <w:hyperlink w:history="1" r:id="rIdccuby5mnwtkd1nkkrifx9">
         <w:r>
           <w:rPr>
             <w:rStyle w:val="Hyperlink"/>
@@ -10300,7 +10300,7 @@
         </w:rPr>
         <w:t xml:space="preserve">   ·   </w:t>
       </w:r>
-      <w:hyperlink w:history="1" r:id="rIdupbp9jon4tonqmpid3tl7">
+      <w:hyperlink w:history="1" r:id="rIdxl061gcsqokrq1lehpoy9">
         <w:r>
           <w:rPr>
             <w:rStyle w:val="Hyperlink"/>
@@ -10322,7 +10322,7 @@
         </w:rPr>
         <w:t xml:space="preserve">   ·   </w:t>
       </w:r>
-      <w:hyperlink w:history="1" r:id="rIdyv3vdl5qyx16n6z42aury">
+      <w:hyperlink w:history="1" r:id="rIdn-agwckevhlnraealkuto">
         <w:r>
           <w:rPr>
             <w:rStyle w:val="Hyperlink"/>
@@ -11026,7 +11026,7 @@
         </w:rPr>
         <w:t xml:space="preserve">Code and artifacts:  </w:t>
       </w:r>
-      <w:hyperlink w:history="1" r:id="rIdfbe4na_pr8gzgndws5xzc">
+      <w:hyperlink w:history="1" r:id="rIdopxvmvnhtdghcl6hyohcm">
         <w:r>
           <w:rPr>
             <w:rStyle w:val="Hyperlink"/>
@@ -11048,7 +11048,7 @@
         </w:rPr>
         <w:t xml:space="preserve">   ·   </w:t>
       </w:r>
-      <w:hyperlink w:history="1" r:id="rIddkdlmgdbhpldihd61u8hm">
+      <w:hyperlink w:history="1" r:id="rIditac_mmnqf3bpznhgfbgw">
         <w:r>
           <w:rPr>
             <w:rStyle w:val="Hyperlink"/>
@@ -11070,7 +11070,7 @@
         </w:rPr>
         <w:t xml:space="preserve">   ·   </w:t>
       </w:r>
-      <w:hyperlink w:history="1" r:id="rIdsuiwe9knjflou3eezni2y">
+      <w:hyperlink w:history="1" r:id="rIdqtttzsmzwmyb3tycmgb0e">
         <w:r>
           <w:rPr>
             <w:rStyle w:val="Hyperlink"/>
@@ -11092,7 +11092,7 @@
         </w:rPr>
         <w:t xml:space="preserve">   ·   </w:t>
       </w:r>
-      <w:hyperlink w:history="1" r:id="rIdrkbxcqgj4fcx5pqhpitez">
+      <w:hyperlink w:history="1" r:id="rIdjppsws02mkcyylfbhs8sy">
         <w:r>
           <w:rPr>
             <w:rStyle w:val="Hyperlink"/>
@@ -11114,7 +11114,7 @@
         </w:rPr>
         <w:t xml:space="preserve">   ·   </w:t>
       </w:r>
-      <w:hyperlink w:history="1" r:id="rIdbqmfkqpngrjyf2jyxqo0v">
+      <w:hyperlink w:history="1" r:id="rIdqita6p9ye_kptqoad-rw2">
         <w:r>
           <w:rPr>
             <w:rStyle w:val="Hyperlink"/>
@@ -11882,7 +11882,35 @@
           <w:sz w:val="21"/>
           <w:szCs w:val="21"/>
         </w:rPr>
-        <w:t xml:space="preserve">Several Part B readings exceed 100% of the recorded theoretical peak, up to 110.93% at N=16384 TF32. This is not a measurement error. The peak figures use the NVIDIA rated boost clock of 2407 MHz, while Part E measured a sustained SM clock of 2737 MHz under load, 1.14 times the rated boost clock, which alone explains readings up to 114% of the rated peak.</w:t>
+        <w:t xml:space="preserve">Several Part B readings exceed 100% of the recorded theoretical peak, up to 110.93% at N=16384 TF32. The first thing to rule out is the denominator being set too low.</w:t>
+      </w:r>
+    </w:p>
+    <w:p>
+      <w:pPr>
+        <w:spacing w:after="120" w:line="276"/>
+      </w:pPr>
+      <w:r>
+        <w:rPr>
+          <w:rFonts w:ascii="Calibri" w:cs="Calibri" w:eastAsia="Calibri" w:hAnsi="Calibri"/>
+          <w:color w:val="1A1A1A"/>
+          <w:sz w:val="21"/>
+          <w:szCs w:val="21"/>
+        </w:rPr>
+        <w:t xml:space="preserve">It is not. The peaks in section 2.2 are the dense figures rather than the sparse ones. The whitepaper prints each tensor row as a dense/sparse pair, and the sparse rate is reachable only on matrices deliberately structured so that half the values are zero, which these are not. They are also the FP32 accumulate variants, because cuBLAS runs torch.matmul on half inputs with FP32 accumulate rather than the faster FP16 accumulate. Both are the smaller figure of the pair available, so the readings cannot be explained away by a generous denominator. For completeness, the 3352 AI TOPS headline on the product page is FP4 with sparsity, exactly twice the 1676 dense rate, and is not used anywhere in this report.</w:t>
+      </w:r>
+    </w:p>
+    <w:p>
+      <w:pPr>
+        <w:spacing w:after="120" w:line="276"/>
+      </w:pPr>
+      <w:r>
+        <w:rPr>
+          <w:rFonts w:ascii="Calibri" w:cs="Calibri" w:eastAsia="Calibri" w:hAnsi="Calibri"/>
+          <w:color w:val="1A1A1A"/>
+          <w:sz w:val="21"/>
+          <w:szCs w:val="21"/>
+        </w:rPr>
+        <w:t xml:space="preserve">The explanation is clock. The peak figures assume the NVIDIA rated boost clock of 2407 MHz, while Part E measured a sustained SM clock of 2737 MHz under load, 1.14 times the rated boost clock, which alone accounts for readings up to 114% of the rated peak.</w:t>
       </w:r>
     </w:p>
     <w:p>
@@ -11997,7 +12025,7 @@
         </w:rPr>
         <w:t xml:space="preserve">Code and artifacts:  </w:t>
       </w:r>
-      <w:hyperlink w:history="1" r:id="rId8ams-joqxmfgcdqk8psx8">
+      <w:hyperlink w:history="1" r:id="rIdrimjhrmulxuouj6rfw9ce">
         <w:r>
           <w:rPr>
             <w:rStyle w:val="Hyperlink"/>
@@ -12579,7 +12607,7 @@
             <w:pPr>
               <w:spacing w:after="0" w:line="240"/>
             </w:pPr>
-            <w:hyperlink w:history="1" r:id="rIdhaofxwjn9lzac_k0d82wa">
+            <w:hyperlink w:history="1" r:id="rIdrsaaoyu9fhuuvqndjr7xu">
               <w:r>
                 <w:rPr>
                   <w:rStyle w:val="Hyperlink"/>
@@ -12637,7 +12665,7 @@
             <w:pPr>
               <w:spacing w:after="0" w:line="240"/>
             </w:pPr>
-            <w:hyperlink w:history="1" r:id="rIdnatsqhcxrytpr4tg6ndtc">
+            <w:hyperlink w:history="1" r:id="rIdtemz2_ub2b-hxroyqqz2p">
               <w:r>
                 <w:rPr>
                   <w:rStyle w:val="Hyperlink"/>
@@ -12695,7 +12723,7 @@
             <w:pPr>
               <w:spacing w:after="0" w:line="240"/>
             </w:pPr>
-            <w:hyperlink w:history="1" r:id="rId-8xdtcxmd3grvrje2z5lc">
+            <w:hyperlink w:history="1" r:id="rIdwe-shvqa-fyt1zextrj_8">
               <w:r>
                 <w:rPr>
                   <w:rStyle w:val="Hyperlink"/>
@@ -12753,7 +12781,7 @@
             <w:pPr>
               <w:spacing w:after="0" w:line="240"/>
             </w:pPr>
-            <w:hyperlink w:history="1" r:id="rId6jjzqexjemrul2unkslig">
+            <w:hyperlink w:history="1" r:id="rIdjt49d-1ezolwdcy56uclh">
               <w:r>
                 <w:rPr>
                   <w:rStyle w:val="Hyperlink"/>
@@ -12811,7 +12839,7 @@
             <w:pPr>
               <w:spacing w:after="0" w:line="240"/>
             </w:pPr>
-            <w:hyperlink w:history="1" r:id="rIdiqw9lgp0su2gdaou08fa2">
+            <w:hyperlink w:history="1" r:id="rIdipqgzz8kv2kkpttgtull6">
               <w:r>
                 <w:rPr>
                   <w:rStyle w:val="Hyperlink"/>
@@ -12869,7 +12897,7 @@
             <w:pPr>
               <w:spacing w:after="0" w:line="240"/>
             </w:pPr>
-            <w:hyperlink w:history="1" r:id="rId471oeqntfh6ihkahscmxx">
+            <w:hyperlink w:history="1" r:id="rId847iedn8slv0zkt6nqshm">
               <w:r>
                 <w:rPr>
                   <w:rStyle w:val="Hyperlink"/>
@@ -12927,7 +12955,7 @@
             <w:pPr>
               <w:spacing w:after="0" w:line="240"/>
             </w:pPr>
-            <w:hyperlink w:history="1" r:id="rId732dvtjrmbmtkf7385_6x">
+            <w:hyperlink w:history="1" r:id="rIdvbvxnebbvm-saiqrzcu2t">
               <w:r>
                 <w:rPr>
                   <w:rStyle w:val="Hyperlink"/>
@@ -12985,7 +13013,7 @@
             <w:pPr>
               <w:spacing w:after="0" w:line="240"/>
             </w:pPr>
-            <w:hyperlink w:history="1" r:id="rIdzuy6u1eyaagj8vquye61g">
+            <w:hyperlink w:history="1" r:id="rIdvwziakhgwltgy-tvptyxz">
               <w:r>
                 <w:rPr>
                   <w:rStyle w:val="Hyperlink"/>
@@ -13043,7 +13071,7 @@
             <w:pPr>
               <w:spacing w:after="0" w:line="240"/>
             </w:pPr>
-            <w:hyperlink w:history="1" r:id="rIdpd3bvxfb2xooyraf9fjfc">
+            <w:hyperlink w:history="1" r:id="rIdzxlexvzjgofitsarucf17">
               <w:r>
                 <w:rPr>
                   <w:rStyle w:val="Hyperlink"/>
@@ -13101,7 +13129,7 @@
             <w:pPr>
               <w:spacing w:after="0" w:line="240"/>
             </w:pPr>
-            <w:hyperlink w:history="1" r:id="rIdfly_pb37nqtkmrtpkmiaa">
+            <w:hyperlink w:history="1" r:id="rIdvocragwazond3szu2czrk">
               <w:r>
                 <w:rPr>
                   <w:rStyle w:val="Hyperlink"/>
@@ -13159,7 +13187,7 @@
             <w:pPr>
               <w:spacing w:after="0" w:line="240"/>
             </w:pPr>
-            <w:hyperlink w:history="1" r:id="rIdpohjf9ovbcbxvrpadahuv">
+            <w:hyperlink w:history="1" r:id="rIdbw6y4ttbqhhg7ga_yssz_">
               <w:r>
                 <w:rPr>
                   <w:rStyle w:val="Hyperlink"/>
@@ -13217,7 +13245,7 @@
             <w:pPr>
               <w:spacing w:after="0" w:line="240"/>
             </w:pPr>
-            <w:hyperlink w:history="1" r:id="rIdg5n0erc3bivt5oj8tphtv">
+            <w:hyperlink w:history="1" r:id="rId4i08g0g1cap67t-xlgrxz">
               <w:r>
                 <w:rPr>
                   <w:rStyle w:val="Hyperlink"/>
@@ -13275,7 +13303,7 @@
             <w:pPr>
               <w:spacing w:after="0" w:line="240"/>
             </w:pPr>
-            <w:hyperlink w:history="1" r:id="rId6yyh1phe6qalxbbf-q4eq">
+            <w:hyperlink w:history="1" r:id="rId_qztdh4chk2yswoiizhsh">
               <w:r>
                 <w:rPr>
                   <w:rStyle w:val="Hyperlink"/>
@@ -13333,7 +13361,7 @@
             <w:pPr>
               <w:spacing w:after="0" w:line="240"/>
             </w:pPr>
-            <w:hyperlink w:history="1" r:id="rIduj3slzb5pauexhprxqt--">
+            <w:hyperlink w:history="1" r:id="rId7frl4rpqdqfeexyzkwlxx">
               <w:r>
                 <w:rPr>
                   <w:rStyle w:val="Hyperlink"/>
@@ -13391,7 +13419,7 @@
             <w:pPr>
               <w:spacing w:after="0" w:line="240"/>
             </w:pPr>
-            <w:hyperlink w:history="1" r:id="rId5arlv1o1qwmclxux8rscw">
+            <w:hyperlink w:history="1" r:id="rIde8lpgunmrgdn4gjxapxgf">
               <w:r>
                 <w:rPr>
                   <w:rStyle w:val="Hyperlink"/>
@@ -13449,7 +13477,7 @@
             <w:pPr>
               <w:spacing w:after="0" w:line="240"/>
             </w:pPr>
-            <w:hyperlink w:history="1" r:id="rIddwkxgulp-cbaazqi6fed0">
+            <w:hyperlink w:history="1" r:id="rIdnv3tgeoqv8rvzdmpn0mj3">
               <w:r>
                 <w:rPr>
                   <w:rStyle w:val="Hyperlink"/>
@@ -13507,7 +13535,7 @@
             <w:pPr>
               <w:spacing w:after="0" w:line="240"/>
             </w:pPr>
-            <w:hyperlink w:history="1" r:id="rIdedjfjjbc594i8pnfc-acf">
+            <w:hyperlink w:history="1" r:id="rIdggbpq5swnajcibtp87mwj">
               <w:r>
                 <w:rPr>
                   <w:rStyle w:val="Hyperlink"/>
@@ -13565,7 +13593,7 @@
             <w:pPr>
               <w:spacing w:after="0" w:line="240"/>
             </w:pPr>
-            <w:hyperlink w:history="1" r:id="rId3bxnlwxr4zzd0ht0tyjxs">
+            <w:hyperlink w:history="1" r:id="rIdlzzaakhppssbw-9f_dv8i">
               <w:r>
                 <w:rPr>
                   <w:rStyle w:val="Hyperlink"/>
@@ -13623,7 +13651,7 @@
             <w:pPr>
               <w:spacing w:after="0" w:line="240"/>
             </w:pPr>
-            <w:hyperlink w:history="1" r:id="rIdwra_k7_erb923zaaczyss">
+            <w:hyperlink w:history="1" r:id="rIdtrgbgnt4zofgv4cuwkqra">
               <w:r>
                 <w:rPr>
                   <w:rStyle w:val="Hyperlink"/>
@@ -13681,7 +13709,7 @@
             <w:pPr>
               <w:spacing w:after="0" w:line="240"/>
             </w:pPr>
-            <w:hyperlink w:history="1" r:id="rIdto533vcngi3xzcnziwuna">
+            <w:hyperlink w:history="1" r:id="rId7xzoj44zp6cbox3ajs-7w">
               <w:r>
                 <w:rPr>
                   <w:rStyle w:val="Hyperlink"/>
@@ -13739,7 +13767,7 @@
             <w:pPr>
               <w:spacing w:after="0" w:line="240"/>
             </w:pPr>
-            <w:hyperlink w:history="1" r:id="rId1dkoo-voqjsgmzov1lfqv">
+            <w:hyperlink w:history="1" r:id="rId3rgeqc8q28jmhv8mdfpjh">
               <w:r>
                 <w:rPr>
                   <w:rStyle w:val="Hyperlink"/>
@@ -13797,7 +13825,7 @@
             <w:pPr>
               <w:spacing w:after="0" w:line="240"/>
             </w:pPr>
-            <w:hyperlink w:history="1" r:id="rId7qxivsgxkrbrvlm7eoij_">
+            <w:hyperlink w:history="1" r:id="rIdxdcyu2lofqk2tp5sxxvu8">
               <w:r>
                 <w:rPr>
                   <w:rStyle w:val="Hyperlink"/>
@@ -13855,7 +13883,7 @@
             <w:pPr>
               <w:spacing w:after="0" w:line="240"/>
             </w:pPr>
-            <w:hyperlink w:history="1" r:id="rIdfof2brdkhjodeljv3flby">
+            <w:hyperlink w:history="1" r:id="rIduk7hfaqmyhnd--aph7i3j">
               <w:r>
                 <w:rPr>
                   <w:rStyle w:val="Hyperlink"/>
@@ -13913,7 +13941,7 @@
             <w:pPr>
               <w:spacing w:after="0" w:line="240"/>
             </w:pPr>
-            <w:hyperlink w:history="1" r:id="rIdlzkqmd6dflseo_0qpi8dw">
+            <w:hyperlink w:history="1" r:id="rIdzhmy5cbkuw4puy0bmad8f">
               <w:r>
                 <w:rPr>
                   <w:rStyle w:val="Hyperlink"/>
@@ -13971,7 +13999,7 @@
             <w:pPr>
               <w:spacing w:after="0" w:line="240"/>
             </w:pPr>
-            <w:hyperlink w:history="1" r:id="rIdahpisvxjjoftka6ov8fxj">
+            <w:hyperlink w:history="1" r:id="rIdkjjksj84evtogn3vl60i5">
               <w:r>
                 <w:rPr>
                   <w:rStyle w:val="Hyperlink"/>
@@ -14029,7 +14057,7 @@
             <w:pPr>
               <w:spacing w:after="0" w:line="240"/>
             </w:pPr>
-            <w:hyperlink w:history="1" r:id="rIdzdq8e0u9wdgg2t5g4zh92">
+            <w:hyperlink w:history="1" r:id="rIdi7xpl7ygdoiwsnf678o-2">
               <w:r>
                 <w:rPr>
                   <w:rStyle w:val="Hyperlink"/>
@@ -14087,7 +14115,7 @@
             <w:pPr>
               <w:spacing w:after="0" w:line="240"/>
             </w:pPr>
-            <w:hyperlink w:history="1" r:id="rIdrpuez0ql0a94jfjsgc9yv">
+            <w:hyperlink w:history="1" r:id="rIduhxdbcdvg7fdenath9xsv">
               <w:r>
                 <w:rPr>
                   <w:rStyle w:val="Hyperlink"/>
@@ -14145,7 +14173,7 @@
             <w:pPr>
               <w:spacing w:after="0" w:line="240"/>
             </w:pPr>
-            <w:hyperlink w:history="1" r:id="rIdmlzm493p1whxgtrida1gx">
+            <w:hyperlink w:history="1" r:id="rIdwvdayget-wwx6dn-ylfhu">
               <w:r>
                 <w:rPr>
                   <w:rStyle w:val="Hyperlink"/>
@@ -14203,7 +14231,7 @@
             <w:pPr>
               <w:spacing w:after="0" w:line="240"/>
             </w:pPr>
-            <w:hyperlink w:history="1" r:id="rIdhxoekmjn8_tvjkc3vdtnt">
+            <w:hyperlink w:history="1" r:id="rIdzosfdwm4tfywy20652gu2">
               <w:r>
                 <w:rPr>
                   <w:rStyle w:val="Hyperlink"/>
@@ -14261,7 +14289,7 @@
             <w:pPr>
               <w:spacing w:after="0" w:line="240"/>
             </w:pPr>
-            <w:hyperlink w:history="1" r:id="rIdjiv1yqgwdtdwgertmh-o-">
+            <w:hyperlink w:history="1" r:id="rId63__uoxt8ks6zj8qhntqw">
               <w:r>
                 <w:rPr>
                   <w:rStyle w:val="Hyperlink"/>
@@ -14319,7 +14347,7 @@
             <w:pPr>
               <w:spacing w:after="0" w:line="240"/>
             </w:pPr>
-            <w:hyperlink w:history="1" r:id="rIdrc9g1lrpguj7zg14luuw6">
+            <w:hyperlink w:history="1" r:id="rIdq_-d9a-fplbfwz7qkeif_">
               <w:r>
                 <w:rPr>
                   <w:rStyle w:val="Hyperlink"/>
@@ -14377,7 +14405,7 @@
             <w:pPr>
               <w:spacing w:after="0" w:line="240"/>
             </w:pPr>
-            <w:hyperlink w:history="1" r:id="rId_mjksjwhcsqzesn0qgpch">
+            <w:hyperlink w:history="1" r:id="rIdrfuez5gmdl0dqpkanxbup">
               <w:r>
                 <w:rPr>
                   <w:rStyle w:val="Hyperlink"/>
@@ -14435,7 +14463,7 @@
             <w:pPr>
               <w:spacing w:after="0" w:line="240"/>
             </w:pPr>
-            <w:hyperlink w:history="1" r:id="rId88zoyns9hyoi9o0h2ixux">
+            <w:hyperlink w:history="1" r:id="rIdpnirszfy0nqs7imaa8fp0">
               <w:r>
                 <w:rPr>
                   <w:rStyle w:val="Hyperlink"/>
@@ -14493,7 +14521,7 @@
             <w:pPr>
               <w:spacing w:after="0" w:line="240"/>
             </w:pPr>
-            <w:hyperlink w:history="1" r:id="rIdtyhoujpqwftam5kyhkv6j">
+            <w:hyperlink w:history="1" r:id="rIdcjvnkknaccg0k6bapzgln">
               <w:r>
                 <w:rPr>
                   <w:rStyle w:val="Hyperlink"/>
@@ -14551,7 +14579,7 @@
             <w:pPr>
               <w:spacing w:after="0" w:line="240"/>
             </w:pPr>
-            <w:hyperlink w:history="1" r:id="rIdnh1tll_db3b-303tdeqo6">
+            <w:hyperlink w:history="1" r:id="rIduwgelypl0uiqbfplyz-iz">
               <w:r>
                 <w:rPr>
                   <w:rStyle w:val="Hyperlink"/>
@@ -14617,7 +14645,7 @@
         </w:rPr>
         <w:t xml:space="preserve">All code, data, logs, figures and generated tables are committed and tagged hw2-5 at </w:t>
       </w:r>
-      <w:hyperlink w:history="1" r:id="rId4qowklt3dx-qhamnyp6fj">
+      <w:hyperlink w:history="1" r:id="rIdr1pf2si12vhn_apbemndz">
         <w:r>
           <w:rPr>
             <w:rStyle w:val="Hyperlink"/>
@@ -14644,7 +14672,7 @@
       <w:pPr>
         <w:spacing w:after="120" w:line="276"/>
       </w:pPr>
-      <w:hyperlink w:history="1" r:id="rIdfbzssuzqooe-uippocm65">
+      <w:hyperlink w:history="1" r:id="rIdm0rjo3-c5aa5linzds51r">
         <w:r>
           <w:rPr>
             <w:rStyle w:val="Hyperlink"/>

</xml_diff>